<commit_message>
chore(resume): refresh Mohammed_Abdul_Rafi_Ahmed_Resume master base
Replace owner master resume and sync into canonical Rafi_Resume.docx
(+ Architect alias) for all daily apply portals; JD tailor still runs
on top while upload filename/label stays Rafi_Resume.

Co-authored-by: rafi-solibri <rafi-solibri@users.noreply.github.com>
</commit_message>
<xml_diff>
--- a/resumes/Mohammed_Abdul_Rafi_Ahmed_Resume.docx
+++ b/resumes/Mohammed_Abdul_Rafi_Ahmed_Resume.docx
@@ -6,9 +6,13 @@
       <w:pPr>
         <w:spacing w:after="50"/>
         <w:jc w:val="center"/>
-      </w:pPr>
-      <w:r>
-        <w:rPr>
+        <w:rPr>
+          <w:rFonts w:ascii="Arial" w:hAnsi="Arial" w:cs="Arial"/>
+        </w:rPr>
+      </w:pPr>
+      <w:r>
+        <w:rPr>
+          <w:rFonts w:ascii="Arial" w:hAnsi="Arial" w:cs="Arial"/>
           <w:b/>
           <w:bCs/>
           <w:smallCaps/>
@@ -19,6 +23,7 @@
       </w:r>
       <w:r>
         <w:rPr>
+          <w:rFonts w:ascii="Arial" w:hAnsi="Arial" w:cs="Arial"/>
           <w:b/>
           <w:bCs/>
           <w:smallCaps/>
@@ -28,6 +33,9 @@
         <w:br/>
       </w:r>
       <w:r>
+        <w:rPr>
+          <w:rFonts w:ascii="Arial" w:hAnsi="Arial" w:cs="Arial"/>
+        </w:rPr>
         <w:t>Technical Architect | Technical Lead — .NET, Cloud &amp; Distributed Systems</w:t>
       </w:r>
     </w:p>
@@ -35,9 +43,13 @@
       <w:pPr>
         <w:spacing w:after="20"/>
         <w:jc w:val="center"/>
-      </w:pPr>
-      <w:r>
-        <w:rPr>
+        <w:rPr>
+          <w:rFonts w:ascii="Arial" w:hAnsi="Arial" w:cs="Arial"/>
+        </w:rPr>
+      </w:pPr>
+      <w:r>
+        <w:rPr>
+          <w:rFonts w:ascii="Arial" w:hAnsi="Arial" w:cs="Arial"/>
           <w:sz w:val="18"/>
           <w:szCs w:val="18"/>
         </w:rPr>
@@ -45,6 +57,7 @@
       </w:r>
       <w:r>
         <w:rPr>
+          <w:rFonts w:ascii="Arial" w:hAnsi="Arial" w:cs="Arial"/>
           <w:sz w:val="18"/>
           <w:szCs w:val="18"/>
         </w:rPr>
@@ -53,6 +66,7 @@
       <w:proofErr w:type="gramStart"/>
       <w:r>
         <w:rPr>
+          <w:rFonts w:ascii="Arial" w:hAnsi="Arial" w:cs="Arial"/>
           <w:sz w:val="18"/>
           <w:szCs w:val="18"/>
         </w:rPr>
@@ -60,6 +74,7 @@
       </w:r>
       <w:r>
         <w:rPr>
+          <w:rFonts w:ascii="Arial" w:hAnsi="Arial" w:cs="Arial"/>
           <w:sz w:val="18"/>
           <w:szCs w:val="18"/>
         </w:rPr>
@@ -68,6 +83,7 @@
       <w:proofErr w:type="gramEnd"/>
       <w:r>
         <w:rPr>
+          <w:rFonts w:ascii="Arial" w:hAnsi="Arial" w:cs="Arial"/>
           <w:sz w:val="18"/>
           <w:szCs w:val="18"/>
         </w:rPr>
@@ -75,6 +91,7 @@
       </w:r>
       <w:r>
         <w:rPr>
+          <w:rFonts w:ascii="Arial" w:hAnsi="Arial" w:cs="Arial"/>
           <w:sz w:val="18"/>
           <w:szCs w:val="18"/>
         </w:rPr>
@@ -83,6 +100,7 @@
       <w:proofErr w:type="gramStart"/>
       <w:r>
         <w:rPr>
+          <w:rFonts w:ascii="Arial" w:hAnsi="Arial" w:cs="Arial"/>
           <w:sz w:val="18"/>
           <w:szCs w:val="18"/>
         </w:rPr>
@@ -90,6 +108,7 @@
       </w:r>
       <w:r>
         <w:rPr>
+          <w:rFonts w:ascii="Arial" w:hAnsi="Arial" w:cs="Arial"/>
           <w:sz w:val="18"/>
           <w:szCs w:val="18"/>
         </w:rPr>
@@ -101,9 +120,13 @@
       <w:pPr>
         <w:spacing w:after="60"/>
         <w:jc w:val="center"/>
-      </w:pPr>
-      <w:r>
-        <w:rPr>
+        <w:rPr>
+          <w:rFonts w:ascii="Arial" w:hAnsi="Arial" w:cs="Arial"/>
+        </w:rPr>
+      </w:pPr>
+      <w:r>
+        <w:rPr>
+          <w:rFonts w:ascii="Arial" w:hAnsi="Arial" w:cs="Arial"/>
           <w:sz w:val="18"/>
           <w:szCs w:val="18"/>
           <w:u w:val="single"/>
@@ -114,6 +137,7 @@
         <w:r>
           <w:rPr>
             <w:rStyle w:val="Hyperlink"/>
+            <w:rFonts w:ascii="Arial" w:hAnsi="Arial" w:cs="Arial"/>
             <w:sz w:val="18"/>
             <w:szCs w:val="18"/>
           </w:rPr>
@@ -123,6 +147,7 @@
         <w:r>
           <w:rPr>
             <w:rStyle w:val="Hyperlink"/>
+            <w:rFonts w:ascii="Arial" w:hAnsi="Arial" w:cs="Arial"/>
             <w:sz w:val="18"/>
             <w:szCs w:val="18"/>
           </w:rPr>
@@ -132,6 +157,7 @@
         <w:r>
           <w:rPr>
             <w:rStyle w:val="Hyperlink"/>
+            <w:rFonts w:ascii="Arial" w:hAnsi="Arial" w:cs="Arial"/>
             <w:sz w:val="18"/>
             <w:szCs w:val="18"/>
           </w:rPr>
@@ -141,6 +167,7 @@
         <w:r>
           <w:rPr>
             <w:rStyle w:val="Hyperlink"/>
+            <w:rFonts w:ascii="Arial" w:hAnsi="Arial" w:cs="Arial"/>
             <w:sz w:val="18"/>
             <w:szCs w:val="18"/>
           </w:rPr>
@@ -150,6 +177,7 @@
         <w:r>
           <w:rPr>
             <w:rStyle w:val="Hyperlink"/>
+            <w:rFonts w:ascii="Arial" w:hAnsi="Arial" w:cs="Arial"/>
             <w:sz w:val="18"/>
             <w:szCs w:val="18"/>
           </w:rPr>
@@ -159,6 +187,7 @@
         <w:r>
           <w:rPr>
             <w:rStyle w:val="Hyperlink"/>
+            <w:rFonts w:ascii="Arial" w:hAnsi="Arial" w:cs="Arial"/>
             <w:sz w:val="18"/>
             <w:szCs w:val="18"/>
           </w:rPr>
@@ -168,6 +197,7 @@
         <w:r>
           <w:rPr>
             <w:rStyle w:val="Hyperlink"/>
+            <w:rFonts w:ascii="Arial" w:hAnsi="Arial" w:cs="Arial"/>
             <w:sz w:val="18"/>
             <w:szCs w:val="18"/>
           </w:rPr>
@@ -181,9 +211,13 @@
           <w:bottom w:val="single" w:sz="12" w:space="1" w:color="555555"/>
         </w:pBdr>
         <w:spacing w:after="80"/>
-      </w:pPr>
-      <w:r>
-        <w:rPr>
+        <w:rPr>
+          <w:rFonts w:ascii="Arial" w:hAnsi="Arial" w:cs="Arial"/>
+        </w:rPr>
+      </w:pPr>
+      <w:r>
+        <w:rPr>
+          <w:rFonts w:ascii="Arial" w:hAnsi="Arial" w:cs="Arial"/>
           <w:sz w:val="4"/>
           <w:szCs w:val="4"/>
         </w:rPr>
@@ -193,9 +227,13 @@
     <w:p>
       <w:pPr>
         <w:spacing w:before="100" w:after="60"/>
-      </w:pPr>
-      <w:r>
-        <w:rPr>
+        <w:rPr>
+          <w:rFonts w:ascii="Arial" w:hAnsi="Arial" w:cs="Arial"/>
+        </w:rPr>
+      </w:pPr>
+      <w:r>
+        <w:rPr>
+          <w:rFonts w:ascii="Arial" w:hAnsi="Arial" w:cs="Arial"/>
           <w:b/>
           <w:bCs/>
           <w:sz w:val="22"/>
@@ -207,17 +245,27 @@
     <w:p>
       <w:pPr>
         <w:spacing w:after="60"/>
-      </w:pPr>
-      <w:r>
+        <w:rPr>
+          <w:rFonts w:ascii="Arial" w:hAnsi="Arial" w:cs="Arial"/>
+        </w:rPr>
+      </w:pPr>
+      <w:r>
+        <w:rPr>
+          <w:rFonts w:ascii="Arial" w:hAnsi="Arial" w:cs="Arial"/>
+        </w:rPr>
         <w:t>Technical Architect with 16 years of experience in technology architecture, software development, and system design. Led complex projects delivering solutions aligned with business goals. Strong problem-solving, strategic planning, and communication skills drive project success and operational efficiency. Focused on enhancing team collaboration and performance in fast-paced environments.</w:t>
       </w:r>
     </w:p>
     <w:p>
       <w:pPr>
         <w:spacing w:before="100" w:after="60"/>
-      </w:pPr>
-      <w:r>
-        <w:rPr>
+        <w:rPr>
+          <w:rFonts w:ascii="Arial" w:hAnsi="Arial" w:cs="Arial"/>
+        </w:rPr>
+      </w:pPr>
+      <w:r>
+        <w:rPr>
+          <w:rFonts w:ascii="Arial" w:hAnsi="Arial" w:cs="Arial"/>
           <w:b/>
           <w:bCs/>
           <w:sz w:val="22"/>
@@ -241,9 +289,13 @@
         </w:pBdr>
         <w:spacing w:after="0" w:line="240" w:lineRule="auto"/>
         <w:ind w:left="259" w:hanging="173"/>
-      </w:pPr>
-      <w:r>
-        <w:rPr>
+        <w:rPr>
+          <w:rFonts w:ascii="Arial" w:hAnsi="Arial" w:cs="Arial"/>
+        </w:rPr>
+      </w:pPr>
+      <w:r>
+        <w:rPr>
+          <w:rFonts w:ascii="Arial" w:hAnsi="Arial" w:cs="Arial"/>
           <w:color w:val="000000"/>
         </w:rPr>
         <w:t>Architected over 20 microservices and 50 REST APIs for distributed building-data platforms serving millions of users.</w:t>
@@ -264,9 +316,13 @@
         </w:pBdr>
         <w:spacing w:after="0" w:line="240" w:lineRule="auto"/>
         <w:ind w:left="259" w:hanging="173"/>
-      </w:pPr>
-      <w:r>
-        <w:rPr>
+        <w:rPr>
+          <w:rFonts w:ascii="Arial" w:hAnsi="Arial" w:cs="Arial"/>
+        </w:rPr>
+      </w:pPr>
+      <w:r>
+        <w:rPr>
+          <w:rFonts w:ascii="Arial" w:hAnsi="Arial" w:cs="Arial"/>
           <w:color w:val="000000"/>
         </w:rPr>
         <w:t>Enhanced application performance through architecture and database optimizations, achieving 25% faster response times.</w:t>
@@ -287,9 +343,13 @@
         </w:pBdr>
         <w:spacing w:after="20" w:line="240" w:lineRule="auto"/>
         <w:ind w:left="259" w:hanging="173"/>
-      </w:pPr>
-      <w:r>
-        <w:rPr>
+        <w:rPr>
+          <w:rFonts w:ascii="Arial" w:hAnsi="Arial" w:cs="Arial"/>
+        </w:rPr>
+      </w:pPr>
+      <w:r>
+        <w:rPr>
+          <w:rFonts w:ascii="Arial" w:hAnsi="Arial" w:cs="Arial"/>
           <w:color w:val="000000"/>
         </w:rPr>
         <w:t>Reduced infrastructure costs by implementing cloud optimization strategies, achieving 15% savings.</w:t>
@@ -298,9 +358,13 @@
     <w:p>
       <w:pPr>
         <w:spacing w:before="100" w:after="60"/>
-      </w:pPr>
-      <w:r>
-        <w:rPr>
+        <w:rPr>
+          <w:rFonts w:ascii="Arial" w:hAnsi="Arial" w:cs="Arial"/>
+        </w:rPr>
+      </w:pPr>
+      <w:r>
+        <w:rPr>
+          <w:rFonts w:ascii="Arial" w:hAnsi="Arial" w:cs="Arial"/>
           <w:b/>
           <w:bCs/>
           <w:sz w:val="22"/>
@@ -329,8 +393,14 @@
           <w:p>
             <w:pPr>
               <w:spacing w:after="20"/>
+              <w:rPr>
+                <w:rFonts w:ascii="Arial" w:hAnsi="Arial" w:cs="Arial"/>
+              </w:rPr>
             </w:pPr>
             <w:r>
+              <w:rPr>
+                <w:rFonts w:ascii="Arial" w:hAnsi="Arial" w:cs="Arial"/>
+              </w:rPr>
               <w:t>• Microservices architecture</w:t>
             </w:r>
           </w:p>
@@ -342,8 +412,14 @@
           <w:p>
             <w:pPr>
               <w:spacing w:after="20"/>
+              <w:rPr>
+                <w:rFonts w:ascii="Arial" w:hAnsi="Arial" w:cs="Arial"/>
+              </w:rPr>
             </w:pPr>
             <w:r>
+              <w:rPr>
+                <w:rFonts w:ascii="Arial" w:hAnsi="Arial" w:cs="Arial"/>
+              </w:rPr>
               <w:t>• Technical architecture</w:t>
             </w:r>
           </w:p>
@@ -357,8 +433,14 @@
           <w:p>
             <w:pPr>
               <w:spacing w:after="20"/>
+              <w:rPr>
+                <w:rFonts w:ascii="Arial" w:hAnsi="Arial" w:cs="Arial"/>
+              </w:rPr>
             </w:pPr>
             <w:r>
+              <w:rPr>
+                <w:rFonts w:ascii="Arial" w:hAnsi="Arial" w:cs="Arial"/>
+              </w:rPr>
               <w:t>• Cloud architecture</w:t>
             </w:r>
           </w:p>
@@ -370,8 +452,14 @@
           <w:p>
             <w:pPr>
               <w:spacing w:after="20"/>
+              <w:rPr>
+                <w:rFonts w:ascii="Arial" w:hAnsi="Arial" w:cs="Arial"/>
+              </w:rPr>
             </w:pPr>
             <w:r>
+              <w:rPr>
+                <w:rFonts w:ascii="Arial" w:hAnsi="Arial" w:cs="Arial"/>
+              </w:rPr>
               <w:t>• Microservices principles</w:t>
             </w:r>
           </w:p>
@@ -385,8 +473,14 @@
           <w:p>
             <w:pPr>
               <w:spacing w:after="20"/>
+              <w:rPr>
+                <w:rFonts w:ascii="Arial" w:hAnsi="Arial" w:cs="Arial"/>
+              </w:rPr>
             </w:pPr>
             <w:r>
+              <w:rPr>
+                <w:rFonts w:ascii="Arial" w:hAnsi="Arial" w:cs="Arial"/>
+              </w:rPr>
               <w:t>• API and integration design</w:t>
             </w:r>
           </w:p>
@@ -398,8 +492,14 @@
           <w:p>
             <w:pPr>
               <w:spacing w:after="20"/>
+              <w:rPr>
+                <w:rFonts w:ascii="Arial" w:hAnsi="Arial" w:cs="Arial"/>
+              </w:rPr>
             </w:pPr>
             <w:r>
+              <w:rPr>
+                <w:rFonts w:ascii="Arial" w:hAnsi="Arial" w:cs="Arial"/>
+              </w:rPr>
               <w:t>• Event-driven architecture</w:t>
             </w:r>
           </w:p>
@@ -413,8 +513,14 @@
           <w:p>
             <w:pPr>
               <w:spacing w:after="20"/>
+              <w:rPr>
+                <w:rFonts w:ascii="Arial" w:hAnsi="Arial" w:cs="Arial"/>
+              </w:rPr>
             </w:pPr>
             <w:r>
+              <w:rPr>
+                <w:rFonts w:ascii="Arial" w:hAnsi="Arial" w:cs="Arial"/>
+              </w:rPr>
               <w:t>• Domain-driven design</w:t>
             </w:r>
           </w:p>
@@ -426,8 +532,14 @@
           <w:p>
             <w:pPr>
               <w:spacing w:after="20"/>
+              <w:rPr>
+                <w:rFonts w:ascii="Arial" w:hAnsi="Arial" w:cs="Arial"/>
+              </w:rPr>
             </w:pPr>
             <w:r>
+              <w:rPr>
+                <w:rFonts w:ascii="Arial" w:hAnsi="Arial" w:cs="Arial"/>
+              </w:rPr>
               <w:t>• Performance optimization</w:t>
             </w:r>
           </w:p>
@@ -441,8 +553,14 @@
           <w:p>
             <w:pPr>
               <w:spacing w:after="20"/>
+              <w:rPr>
+                <w:rFonts w:ascii="Arial" w:hAnsi="Arial" w:cs="Arial"/>
+              </w:rPr>
             </w:pPr>
             <w:r>
+              <w:rPr>
+                <w:rFonts w:ascii="Arial" w:hAnsi="Arial" w:cs="Arial"/>
+              </w:rPr>
               <w:t>• CI/CD implementation</w:t>
             </w:r>
           </w:p>
@@ -454,8 +572,14 @@
           <w:p>
             <w:pPr>
               <w:spacing w:after="20"/>
+              <w:rPr>
+                <w:rFonts w:ascii="Arial" w:hAnsi="Arial" w:cs="Arial"/>
+              </w:rPr>
             </w:pPr>
             <w:r>
+              <w:rPr>
+                <w:rFonts w:ascii="Arial" w:hAnsi="Arial" w:cs="Arial"/>
+              </w:rPr>
               <w:t>• CI practices</w:t>
             </w:r>
           </w:p>
@@ -469,8 +593,14 @@
           <w:p>
             <w:pPr>
               <w:spacing w:after="20"/>
+              <w:rPr>
+                <w:rFonts w:ascii="Arial" w:hAnsi="Arial" w:cs="Arial"/>
+              </w:rPr>
             </w:pPr>
             <w:r>
+              <w:rPr>
+                <w:rFonts w:ascii="Arial" w:hAnsi="Arial" w:cs="Arial"/>
+              </w:rPr>
               <w:t>• Containerization and orchestration</w:t>
             </w:r>
           </w:p>
@@ -482,8 +612,14 @@
           <w:p>
             <w:pPr>
               <w:spacing w:after="20"/>
+              <w:rPr>
+                <w:rFonts w:ascii="Arial" w:hAnsi="Arial" w:cs="Arial"/>
+              </w:rPr>
             </w:pPr>
             <w:r>
+              <w:rPr>
+                <w:rFonts w:ascii="Arial" w:hAnsi="Arial" w:cs="Arial"/>
+              </w:rPr>
               <w:t>• REST API design</w:t>
             </w:r>
           </w:p>
@@ -497,8 +633,14 @@
           <w:p>
             <w:pPr>
               <w:spacing w:after="20"/>
+              <w:rPr>
+                <w:rFonts w:ascii="Arial" w:hAnsi="Arial" w:cs="Arial"/>
+              </w:rPr>
             </w:pPr>
             <w:r>
+              <w:rPr>
+                <w:rFonts w:ascii="Arial" w:hAnsi="Arial" w:cs="Arial"/>
+              </w:rPr>
               <w:t>• .NET Core / ASP.NET Core</w:t>
             </w:r>
           </w:p>
@@ -510,8 +652,14 @@
           <w:p>
             <w:pPr>
               <w:spacing w:after="20"/>
+              <w:rPr>
+                <w:rFonts w:ascii="Arial" w:hAnsi="Arial" w:cs="Arial"/>
+              </w:rPr>
             </w:pPr>
             <w:r>
+              <w:rPr>
+                <w:rFonts w:ascii="Arial" w:hAnsi="Arial" w:cs="Arial"/>
+              </w:rPr>
               <w:t>• C# programming</w:t>
             </w:r>
           </w:p>
@@ -525,8 +673,14 @@
           <w:p>
             <w:pPr>
               <w:spacing w:after="20"/>
+              <w:rPr>
+                <w:rFonts w:ascii="Arial" w:hAnsi="Arial" w:cs="Arial"/>
+              </w:rPr>
             </w:pPr>
             <w:r>
+              <w:rPr>
+                <w:rFonts w:ascii="Arial" w:hAnsi="Arial" w:cs="Arial"/>
+              </w:rPr>
               <w:t>• SQL Server management</w:t>
             </w:r>
           </w:p>
@@ -538,8 +692,14 @@
           <w:p>
             <w:pPr>
               <w:spacing w:after="20"/>
+              <w:rPr>
+                <w:rFonts w:ascii="Arial" w:hAnsi="Arial" w:cs="Arial"/>
+              </w:rPr>
             </w:pPr>
             <w:r>
+              <w:rPr>
+                <w:rFonts w:ascii="Arial" w:hAnsi="Arial" w:cs="Arial"/>
+              </w:rPr>
               <w:t>• PostgreSQL management</w:t>
             </w:r>
           </w:p>
@@ -553,8 +713,14 @@
           <w:p>
             <w:pPr>
               <w:spacing w:after="20"/>
+              <w:rPr>
+                <w:rFonts w:ascii="Arial" w:hAnsi="Arial" w:cs="Arial"/>
+              </w:rPr>
             </w:pPr>
             <w:r>
+              <w:rPr>
+                <w:rFonts w:ascii="Arial" w:hAnsi="Arial" w:cs="Arial"/>
+              </w:rPr>
               <w:t>• Database tuning techniques</w:t>
             </w:r>
           </w:p>
@@ -566,8 +732,14 @@
           <w:p>
             <w:pPr>
               <w:spacing w:after="20"/>
+              <w:rPr>
+                <w:rFonts w:ascii="Arial" w:hAnsi="Arial" w:cs="Arial"/>
+              </w:rPr>
             </w:pPr>
             <w:r>
+              <w:rPr>
+                <w:rFonts w:ascii="Arial" w:hAnsi="Arial" w:cs="Arial"/>
+              </w:rPr>
               <w:t>• Disaster recovery</w:t>
             </w:r>
           </w:p>
@@ -581,8 +753,14 @@
           <w:p>
             <w:pPr>
               <w:spacing w:after="20"/>
+              <w:rPr>
+                <w:rFonts w:ascii="Arial" w:hAnsi="Arial" w:cs="Arial"/>
+              </w:rPr>
             </w:pPr>
             <w:r>
+              <w:rPr>
+                <w:rFonts w:ascii="Arial" w:hAnsi="Arial" w:cs="Arial"/>
+              </w:rPr>
               <w:t>• Software development</w:t>
             </w:r>
           </w:p>
@@ -594,8 +772,14 @@
           <w:p>
             <w:pPr>
               <w:spacing w:after="20"/>
+              <w:rPr>
+                <w:rFonts w:ascii="Arial" w:hAnsi="Arial" w:cs="Arial"/>
+              </w:rPr>
             </w:pPr>
             <w:r>
+              <w:rPr>
+                <w:rFonts w:ascii="Arial" w:hAnsi="Arial" w:cs="Arial"/>
+              </w:rPr>
               <w:t>• Enterprise software development</w:t>
             </w:r>
           </w:p>
@@ -609,8 +793,14 @@
           <w:p>
             <w:pPr>
               <w:spacing w:after="20"/>
+              <w:rPr>
+                <w:rFonts w:ascii="Arial" w:hAnsi="Arial" w:cs="Arial"/>
+              </w:rPr>
             </w:pPr>
             <w:r>
+              <w:rPr>
+                <w:rFonts w:ascii="Arial" w:hAnsi="Arial" w:cs="Arial"/>
+              </w:rPr>
               <w:t>• Web applications</w:t>
             </w:r>
           </w:p>
@@ -622,8 +812,14 @@
           <w:p>
             <w:pPr>
               <w:spacing w:after="20"/>
+              <w:rPr>
+                <w:rFonts w:ascii="Arial" w:hAnsi="Arial" w:cs="Arial"/>
+              </w:rPr>
             </w:pPr>
             <w:r>
+              <w:rPr>
+                <w:rFonts w:ascii="Arial" w:hAnsi="Arial" w:cs="Arial"/>
+              </w:rPr>
               <w:t>• System design</w:t>
             </w:r>
           </w:p>
@@ -637,8 +833,14 @@
           <w:p>
             <w:pPr>
               <w:spacing w:after="20"/>
+              <w:rPr>
+                <w:rFonts w:ascii="Arial" w:hAnsi="Arial" w:cs="Arial"/>
+              </w:rPr>
             </w:pPr>
             <w:r>
+              <w:rPr>
+                <w:rFonts w:ascii="Arial" w:hAnsi="Arial" w:cs="Arial"/>
+              </w:rPr>
               <w:t>• Data modeling</w:t>
             </w:r>
           </w:p>
@@ -650,8 +852,14 @@
           <w:p>
             <w:pPr>
               <w:spacing w:after="20"/>
+              <w:rPr>
+                <w:rFonts w:ascii="Arial" w:hAnsi="Arial" w:cs="Arial"/>
+              </w:rPr>
             </w:pPr>
             <w:r>
+              <w:rPr>
+                <w:rFonts w:ascii="Arial" w:hAnsi="Arial" w:cs="Arial"/>
+              </w:rPr>
               <w:t>• Code review practices</w:t>
             </w:r>
           </w:p>
@@ -665,8 +873,14 @@
           <w:p>
             <w:pPr>
               <w:spacing w:after="20"/>
+              <w:rPr>
+                <w:rFonts w:ascii="Arial" w:hAnsi="Arial" w:cs="Arial"/>
+              </w:rPr>
             </w:pPr>
             <w:r>
+              <w:rPr>
+                <w:rFonts w:ascii="Arial" w:hAnsi="Arial" w:cs="Arial"/>
+              </w:rPr>
               <w:t>• Frontend architecture</w:t>
             </w:r>
           </w:p>
@@ -678,8 +892,14 @@
           <w:p>
             <w:pPr>
               <w:spacing w:after="20"/>
+              <w:rPr>
+                <w:rFonts w:ascii="Arial" w:hAnsi="Arial" w:cs="Arial"/>
+              </w:rPr>
             </w:pPr>
             <w:r>
+              <w:rPr>
+                <w:rFonts w:ascii="Arial" w:hAnsi="Arial" w:cs="Arial"/>
+              </w:rPr>
               <w:t>• Team leadership</w:t>
             </w:r>
           </w:p>
@@ -693,8 +913,14 @@
           <w:p>
             <w:pPr>
               <w:spacing w:after="20"/>
+              <w:rPr>
+                <w:rFonts w:ascii="Arial" w:hAnsi="Arial" w:cs="Arial"/>
+              </w:rPr>
             </w:pPr>
             <w:r>
+              <w:rPr>
+                <w:rFonts w:ascii="Arial" w:hAnsi="Arial" w:cs="Arial"/>
+              </w:rPr>
               <w:t>• Stakeholder engagement</w:t>
             </w:r>
           </w:p>
@@ -706,8 +932,14 @@
           <w:p>
             <w:pPr>
               <w:spacing w:after="20"/>
+              <w:rPr>
+                <w:rFonts w:ascii="Arial" w:hAnsi="Arial" w:cs="Arial"/>
+              </w:rPr>
             </w:pPr>
             <w:r>
+              <w:rPr>
+                <w:rFonts w:ascii="Arial" w:hAnsi="Arial" w:cs="Arial"/>
+              </w:rPr>
               <w:t>• Infrastructure automation</w:t>
             </w:r>
           </w:p>
@@ -721,8 +953,14 @@
           <w:p>
             <w:pPr>
               <w:spacing w:after="20"/>
+              <w:rPr>
+                <w:rFonts w:ascii="Arial" w:hAnsi="Arial" w:cs="Arial"/>
+              </w:rPr>
             </w:pPr>
             <w:r>
+              <w:rPr>
+                <w:rFonts w:ascii="Arial" w:hAnsi="Arial" w:cs="Arial"/>
+              </w:rPr>
               <w:t>• Enterprise architecture design</w:t>
             </w:r>
           </w:p>
@@ -734,8 +972,14 @@
           <w:p>
             <w:pPr>
               <w:spacing w:after="20"/>
+              <w:rPr>
+                <w:rFonts w:ascii="Arial" w:hAnsi="Arial" w:cs="Arial"/>
+              </w:rPr>
             </w:pPr>
             <w:r>
+              <w:rPr>
+                <w:rFonts w:ascii="Arial" w:hAnsi="Arial" w:cs="Arial"/>
+              </w:rPr>
               <w:t>• Client engagement</w:t>
             </w:r>
           </w:p>
@@ -749,8 +993,14 @@
           <w:p>
             <w:pPr>
               <w:spacing w:after="20"/>
+              <w:rPr>
+                <w:rFonts w:ascii="Arial" w:hAnsi="Arial" w:cs="Arial"/>
+              </w:rPr>
             </w:pPr>
             <w:r>
+              <w:rPr>
+                <w:rFonts w:ascii="Arial" w:hAnsi="Arial" w:cs="Arial"/>
+              </w:rPr>
               <w:t>• Communicating with clients</w:t>
             </w:r>
           </w:p>
@@ -759,16 +1009,26 @@
           <w:tcPr>
             <w:tcW w:w="5184" w:type="dxa"/>
           </w:tcPr>
-          <w:p/>
+          <w:p>
+            <w:pPr>
+              <w:rPr>
+                <w:rFonts w:ascii="Arial" w:hAnsi="Arial" w:cs="Arial"/>
+              </w:rPr>
+            </w:pPr>
+          </w:p>
         </w:tc>
       </w:tr>
     </w:tbl>
     <w:p>
       <w:pPr>
         <w:spacing w:before="100" w:after="60"/>
-      </w:pPr>
-      <w:r>
-        <w:rPr>
+        <w:rPr>
+          <w:rFonts w:ascii="Arial" w:hAnsi="Arial" w:cs="Arial"/>
+        </w:rPr>
+      </w:pPr>
+      <w:r>
+        <w:rPr>
+          <w:rFonts w:ascii="Arial" w:hAnsi="Arial" w:cs="Arial"/>
           <w:b/>
           <w:bCs/>
           <w:sz w:val="22"/>
@@ -780,9 +1040,13 @@
     <w:p>
       <w:pPr>
         <w:spacing w:before="60" w:after="0"/>
-      </w:pPr>
-      <w:r>
-        <w:rPr>
+        <w:rPr>
+          <w:rFonts w:ascii="Arial" w:hAnsi="Arial" w:cs="Arial"/>
+        </w:rPr>
+      </w:pPr>
+      <w:r>
+        <w:rPr>
+          <w:rFonts w:ascii="Arial" w:hAnsi="Arial" w:cs="Arial"/>
           <w:b/>
           <w:bCs/>
           <w:sz w:val="20"/>
@@ -794,9 +1058,13 @@
     <w:p>
       <w:pPr>
         <w:spacing w:after="20"/>
-      </w:pPr>
-      <w:r>
-        <w:rPr>
+        <w:rPr>
+          <w:rFonts w:ascii="Arial" w:hAnsi="Arial" w:cs="Arial"/>
+        </w:rPr>
+      </w:pPr>
+      <w:r>
+        <w:rPr>
+          <w:rFonts w:ascii="Arial" w:hAnsi="Arial" w:cs="Arial"/>
           <w:b/>
           <w:bCs/>
         </w:rPr>
@@ -818,9 +1086,13 @@
         </w:pBdr>
         <w:spacing w:after="0" w:line="240" w:lineRule="auto"/>
         <w:ind w:left="259" w:hanging="173"/>
-      </w:pPr>
-      <w:r>
-        <w:rPr>
+        <w:rPr>
+          <w:rFonts w:ascii="Arial" w:hAnsi="Arial" w:cs="Arial"/>
+        </w:rPr>
+      </w:pPr>
+      <w:r>
+        <w:rPr>
+          <w:rFonts w:ascii="Arial" w:hAnsi="Arial" w:cs="Arial"/>
           <w:color w:val="000000"/>
         </w:rPr>
         <w:t>Architected and optimized 20+ microservices and 50+ REST APIs supporting 1M+ users, delivering 25% improvement in application performance and 20% reduction in cloud/infrastructure costs.</w:t>
@@ -841,9 +1113,13 @@
         </w:pBdr>
         <w:spacing w:after="0" w:line="240" w:lineRule="auto"/>
         <w:ind w:left="259" w:hanging="173"/>
-      </w:pPr>
-      <w:r>
-        <w:rPr>
+        <w:rPr>
+          <w:rFonts w:ascii="Arial" w:hAnsi="Arial" w:cs="Arial"/>
+        </w:rPr>
+      </w:pPr>
+      <w:r>
+        <w:rPr>
+          <w:rFonts w:ascii="Arial" w:hAnsi="Arial" w:cs="Arial"/>
           <w:color w:val="000000"/>
         </w:rPr>
         <w:t>Led enterprise architecture initiatives across 4 teams/workstreams, improving system scalability by 30% and reducing technical/operational issues by 20%.</w:t>
@@ -864,9 +1140,13 @@
         </w:pBdr>
         <w:spacing w:after="20" w:line="240" w:lineRule="auto"/>
         <w:ind w:left="259" w:hanging="173"/>
-      </w:pPr>
-      <w:r>
-        <w:rPr>
+        <w:rPr>
+          <w:rFonts w:ascii="Arial" w:hAnsi="Arial" w:cs="Arial"/>
+        </w:rPr>
+      </w:pPr>
+      <w:r>
+        <w:rPr>
+          <w:rFonts w:ascii="Arial" w:hAnsi="Arial" w:cs="Arial"/>
           <w:color w:val="000000"/>
         </w:rPr>
         <w:t>Partnered with engineering and business stakeholders to deliver 15+ architectural improvements/features, accelerating delivery by 20%.</w:t>
@@ -875,9 +1155,13 @@
     <w:p>
       <w:pPr>
         <w:spacing w:before="60" w:after="0"/>
-      </w:pPr>
-      <w:r>
-        <w:rPr>
+        <w:rPr>
+          <w:rFonts w:ascii="Arial" w:hAnsi="Arial" w:cs="Arial"/>
+        </w:rPr>
+      </w:pPr>
+      <w:r>
+        <w:rPr>
+          <w:rFonts w:ascii="Arial" w:hAnsi="Arial" w:cs="Arial"/>
           <w:b/>
           <w:bCs/>
           <w:sz w:val="20"/>
@@ -889,9 +1173,13 @@
     <w:p>
       <w:pPr>
         <w:spacing w:after="20"/>
-      </w:pPr>
-      <w:r>
-        <w:rPr>
+        <w:rPr>
+          <w:rFonts w:ascii="Arial" w:hAnsi="Arial" w:cs="Arial"/>
+        </w:rPr>
+      </w:pPr>
+      <w:r>
+        <w:rPr>
+          <w:rFonts w:ascii="Arial" w:hAnsi="Arial" w:cs="Arial"/>
           <w:b/>
           <w:bCs/>
         </w:rPr>
@@ -913,9 +1201,13 @@
         </w:pBdr>
         <w:spacing w:after="0" w:line="240" w:lineRule="auto"/>
         <w:ind w:left="259" w:hanging="173"/>
-      </w:pPr>
-      <w:r>
-        <w:rPr>
+        <w:rPr>
+          <w:rFonts w:ascii="Arial" w:hAnsi="Arial" w:cs="Arial"/>
+        </w:rPr>
+      </w:pPr>
+      <w:r>
+        <w:rPr>
+          <w:rFonts w:ascii="Arial" w:hAnsi="Arial" w:cs="Arial"/>
           <w:color w:val="000000"/>
         </w:rPr>
         <w:t>Redesigned and optimized architecture for enterprise construction-software applications serving 1M+ users, improving application performance by 25% and scalability by 30%.</w:t>
@@ -936,9 +1228,13 @@
         </w:pBdr>
         <w:spacing w:after="0" w:line="240" w:lineRule="auto"/>
         <w:ind w:left="259" w:hanging="173"/>
-      </w:pPr>
-      <w:r>
-        <w:rPr>
+        <w:rPr>
+          <w:rFonts w:ascii="Arial" w:hAnsi="Arial" w:cs="Arial"/>
+        </w:rPr>
+      </w:pPr>
+      <w:r>
+        <w:rPr>
+          <w:rFonts w:ascii="Arial" w:hAnsi="Arial" w:cs="Arial"/>
           <w:color w:val="000000"/>
         </w:rPr>
         <w:t>Aligned 30+ technical requirements across cross-functional teams, accelerating delivery by 20% and improving business-to-engineering alignment.</w:t>
@@ -959,9 +1255,13 @@
         </w:pBdr>
         <w:spacing w:after="20" w:line="240" w:lineRule="auto"/>
         <w:ind w:left="259" w:hanging="173"/>
-      </w:pPr>
-      <w:r>
-        <w:rPr>
+        <w:rPr>
+          <w:rFonts w:ascii="Arial" w:hAnsi="Arial" w:cs="Arial"/>
+        </w:rPr>
+      </w:pPr>
+      <w:r>
+        <w:rPr>
+          <w:rFonts w:ascii="Arial" w:hAnsi="Arial" w:cs="Arial"/>
           <w:color w:val="000000"/>
         </w:rPr>
         <w:t>Identified and resolved 15+ architectural/performance bottlenecks, reducing system issues by 25% and improving reliability by 20%.</w:t>
@@ -971,6 +1271,7 @@
       <w:pPr>
         <w:spacing w:before="60" w:after="0"/>
         <w:rPr>
+          <w:rFonts w:ascii="Arial" w:hAnsi="Arial" w:cs="Arial"/>
           <w:b/>
           <w:bCs/>
           <w:sz w:val="20"/>
@@ -982,6 +1283,7 @@
       <w:pPr>
         <w:spacing w:before="60" w:after="0"/>
         <w:rPr>
+          <w:rFonts w:ascii="Arial" w:hAnsi="Arial" w:cs="Arial"/>
           <w:b/>
           <w:bCs/>
           <w:sz w:val="20"/>
@@ -992,24 +1294,31 @@
     <w:p>
       <w:pPr>
         <w:spacing w:before="60" w:after="0"/>
-      </w:pPr>
-      <w:r>
-        <w:rPr>
+        <w:rPr>
+          <w:rFonts w:ascii="Arial" w:hAnsi="Arial" w:cs="Arial"/>
+        </w:rPr>
+      </w:pPr>
+      <w:r>
+        <w:rPr>
+          <w:rFonts w:ascii="Arial" w:hAnsi="Arial" w:cs="Arial"/>
           <w:b/>
           <w:bCs/>
           <w:sz w:val="20"/>
           <w:szCs w:val="20"/>
         </w:rPr>
-        <w:lastRenderedPageBreak/>
         <w:t>Technical Lead, 05/2020 to 07/2023</w:t>
       </w:r>
     </w:p>
     <w:p>
       <w:pPr>
         <w:spacing w:after="20"/>
-      </w:pPr>
-      <w:r>
-        <w:rPr>
+        <w:rPr>
+          <w:rFonts w:ascii="Arial" w:hAnsi="Arial" w:cs="Arial"/>
+        </w:rPr>
+      </w:pPr>
+      <w:r>
+        <w:rPr>
+          <w:rFonts w:ascii="Arial" w:hAnsi="Arial" w:cs="Arial"/>
           <w:b/>
           <w:bCs/>
         </w:rPr>
@@ -1031,9 +1340,13 @@
         </w:pBdr>
         <w:spacing w:after="0" w:line="240" w:lineRule="auto"/>
         <w:ind w:left="259" w:hanging="173"/>
-      </w:pPr>
-      <w:r>
-        <w:rPr>
+        <w:rPr>
+          <w:rFonts w:ascii="Arial" w:hAnsi="Arial" w:cs="Arial"/>
+        </w:rPr>
+      </w:pPr>
+      <w:r>
+        <w:rPr>
+          <w:rFonts w:ascii="Arial" w:hAnsi="Arial" w:cs="Arial"/>
           <w:color w:val="000000"/>
         </w:rPr>
         <w:t>Architected 15+ scalable.NET Core and Scala backend services supporting 500K+ healthcare workflows/users, reducing response times by 30% and increasing processing capacity by 40%.</w:t>
@@ -1054,9 +1367,13 @@
         </w:pBdr>
         <w:spacing w:after="0" w:line="240" w:lineRule="auto"/>
         <w:ind w:left="259" w:hanging="173"/>
-      </w:pPr>
-      <w:r>
-        <w:rPr>
+        <w:rPr>
+          <w:rFonts w:ascii="Arial" w:hAnsi="Arial" w:cs="Arial"/>
+        </w:rPr>
+      </w:pPr>
+      <w:r>
+        <w:rPr>
+          <w:rFonts w:ascii="Arial" w:hAnsi="Arial" w:cs="Arial"/>
           <w:color w:val="000000"/>
         </w:rPr>
         <w:t>Led a team of 10 engineers to deliver a cloud-native healthcare platform, achieving 25% improvement in service availability and supporting 1M+ users/transactions.</w:t>
@@ -1077,9 +1394,13 @@
         </w:pBdr>
         <w:spacing w:after="0" w:line="240" w:lineRule="auto"/>
         <w:ind w:left="259" w:hanging="173"/>
-      </w:pPr>
-      <w:r>
-        <w:rPr>
+        <w:rPr>
+          <w:rFonts w:ascii="Arial" w:hAnsi="Arial" w:cs="Arial"/>
+        </w:rPr>
+      </w:pPr>
+      <w:r>
+        <w:rPr>
+          <w:rFonts w:ascii="Arial" w:hAnsi="Arial" w:cs="Arial"/>
           <w:color w:val="000000"/>
         </w:rPr>
         <w:t>Directed Docker and Kubernetes deployment strategy across 6 environments, reducing deployment time by 40% and deployment-related incidents by 30%.</w:t>
@@ -1100,9 +1421,13 @@
         </w:pBdr>
         <w:spacing w:after="20" w:line="240" w:lineRule="auto"/>
         <w:ind w:left="259" w:hanging="173"/>
-      </w:pPr>
-      <w:r>
-        <w:rPr>
+        <w:rPr>
+          <w:rFonts w:ascii="Arial" w:hAnsi="Arial" w:cs="Arial"/>
+        </w:rPr>
+      </w:pPr>
+      <w:r>
+        <w:rPr>
+          <w:rFonts w:ascii="Arial" w:hAnsi="Arial" w:cs="Arial"/>
           <w:color w:val="000000"/>
         </w:rPr>
         <w:t>Architected scalable backend services with.NET Core and Scala for enterprise healthcare workflows.</w:t>
@@ -1111,9 +1436,13 @@
     <w:p>
       <w:pPr>
         <w:spacing w:before="60" w:after="0"/>
-      </w:pPr>
-      <w:r>
-        <w:rPr>
+        <w:rPr>
+          <w:rFonts w:ascii="Arial" w:hAnsi="Arial" w:cs="Arial"/>
+        </w:rPr>
+      </w:pPr>
+      <w:r>
+        <w:rPr>
+          <w:rFonts w:ascii="Arial" w:hAnsi="Arial" w:cs="Arial"/>
           <w:b/>
           <w:bCs/>
           <w:sz w:val="20"/>
@@ -1125,9 +1454,13 @@
     <w:p>
       <w:pPr>
         <w:spacing w:after="20"/>
-      </w:pPr>
-      <w:r>
-        <w:rPr>
+        <w:rPr>
+          <w:rFonts w:ascii="Arial" w:hAnsi="Arial" w:cs="Arial"/>
+        </w:rPr>
+      </w:pPr>
+      <w:r>
+        <w:rPr>
+          <w:rFonts w:ascii="Arial" w:hAnsi="Arial" w:cs="Arial"/>
           <w:b/>
           <w:bCs/>
         </w:rPr>
@@ -1149,9 +1482,13 @@
         </w:pBdr>
         <w:spacing w:after="0" w:line="240" w:lineRule="auto"/>
         <w:ind w:left="259" w:hanging="173"/>
-      </w:pPr>
-      <w:r>
-        <w:rPr>
+        <w:rPr>
+          <w:rFonts w:ascii="Arial" w:hAnsi="Arial" w:cs="Arial"/>
+        </w:rPr>
+      </w:pPr>
+      <w:r>
+        <w:rPr>
+          <w:rFonts w:ascii="Arial" w:hAnsi="Arial" w:cs="Arial"/>
           <w:color w:val="000000"/>
         </w:rPr>
         <w:t>Led technical delivery across 3 concurrent healthcare software workstreams, delivering 20+ features/releases and improving delivery efficiency by 25%.</w:t>
@@ -1172,9 +1509,13 @@
         </w:pBdr>
         <w:spacing w:after="0" w:line="240" w:lineRule="auto"/>
         <w:ind w:left="259" w:hanging="173"/>
-      </w:pPr>
-      <w:r>
-        <w:rPr>
+        <w:rPr>
+          <w:rFonts w:ascii="Arial" w:hAnsi="Arial" w:cs="Arial"/>
+        </w:rPr>
+      </w:pPr>
+      <w:r>
+        <w:rPr>
+          <w:rFonts w:ascii="Arial" w:hAnsi="Arial" w:cs="Arial"/>
           <w:color w:val="000000"/>
         </w:rPr>
         <w:t>Coordinated requirements and timelines with 12+ stakeholders, achieving 95% on-time delivery across committed milestones.</w:t>
@@ -1195,9 +1536,13 @@
         </w:pBdr>
         <w:spacing w:after="0" w:line="240" w:lineRule="auto"/>
         <w:ind w:left="259" w:hanging="173"/>
-      </w:pPr>
-      <w:r>
-        <w:rPr>
+        <w:rPr>
+          <w:rFonts w:ascii="Arial" w:hAnsi="Arial" w:cs="Arial"/>
+        </w:rPr>
+      </w:pPr>
+      <w:r>
+        <w:rPr>
+          <w:rFonts w:ascii="Arial" w:hAnsi="Arial" w:cs="Arial"/>
           <w:color w:val="000000"/>
         </w:rPr>
         <w:t>Managed 8+ concurrent priorities under tight deadlines, improving delivery predictability by 20% while maintaining quality standards.</w:t>
@@ -1218,9 +1563,13 @@
         </w:pBdr>
         <w:spacing w:after="20" w:line="240" w:lineRule="auto"/>
         <w:ind w:left="259" w:hanging="173"/>
-      </w:pPr>
-      <w:r>
-        <w:rPr>
+        <w:rPr>
+          <w:rFonts w:ascii="Arial" w:hAnsi="Arial" w:cs="Arial"/>
+        </w:rPr>
+      </w:pPr>
+      <w:r>
+        <w:rPr>
+          <w:rFonts w:ascii="Arial" w:hAnsi="Arial" w:cs="Arial"/>
           <w:color w:val="000000"/>
         </w:rPr>
         <w:t>Resolved 30+ technical issues and production blockers, reducing project disruption by 30% and maintaining delivery momentum.</w:t>
@@ -1229,9 +1578,13 @@
     <w:p>
       <w:pPr>
         <w:spacing w:before="60" w:after="0"/>
-      </w:pPr>
-      <w:r>
-        <w:rPr>
+        <w:rPr>
+          <w:rFonts w:ascii="Arial" w:hAnsi="Arial" w:cs="Arial"/>
+        </w:rPr>
+      </w:pPr>
+      <w:r>
+        <w:rPr>
+          <w:rFonts w:ascii="Arial" w:hAnsi="Arial" w:cs="Arial"/>
           <w:b/>
           <w:bCs/>
           <w:sz w:val="20"/>
@@ -1243,9 +1596,13 @@
     <w:p>
       <w:pPr>
         <w:spacing w:after="20"/>
-      </w:pPr>
-      <w:r>
-        <w:rPr>
+        <w:rPr>
+          <w:rFonts w:ascii="Arial" w:hAnsi="Arial" w:cs="Arial"/>
+        </w:rPr>
+      </w:pPr>
+      <w:r>
+        <w:rPr>
+          <w:rFonts w:ascii="Arial" w:hAnsi="Arial" w:cs="Arial"/>
           <w:b/>
           <w:bCs/>
         </w:rPr>
@@ -1267,9 +1624,13 @@
         </w:pBdr>
         <w:spacing w:after="0" w:line="240" w:lineRule="auto"/>
         <w:ind w:left="259" w:hanging="173"/>
-      </w:pPr>
-      <w:r>
-        <w:rPr>
+        <w:rPr>
+          <w:rFonts w:ascii="Arial" w:hAnsi="Arial" w:cs="Arial"/>
+        </w:rPr>
+      </w:pPr>
+      <w:r>
+        <w:rPr>
+          <w:rFonts w:ascii="Arial" w:hAnsi="Arial" w:cs="Arial"/>
           <w:color w:val="000000"/>
         </w:rPr>
         <w:t>Developed and enhanced 25+ scalable application features/APIs, improving application performance by 25% and supporting 1M+ users/transactions.</w:t>
@@ -1290,9 +1651,13 @@
         </w:pBdr>
         <w:spacing w:after="0" w:line="240" w:lineRule="auto"/>
         <w:ind w:left="259" w:hanging="173"/>
-      </w:pPr>
-      <w:r>
-        <w:rPr>
+        <w:rPr>
+          <w:rFonts w:ascii="Arial" w:hAnsi="Arial" w:cs="Arial"/>
+        </w:rPr>
+      </w:pPr>
+      <w:r>
+        <w:rPr>
+          <w:rFonts w:ascii="Arial" w:hAnsi="Arial" w:cs="Arial"/>
           <w:color w:val="000000"/>
         </w:rPr>
         <w:t>Delivered 15+ application features that increased user engagement by 20% and improved feature adoption by 15%.</w:t>
@@ -1313,9 +1678,13 @@
         </w:pBdr>
         <w:spacing w:after="0" w:line="240" w:lineRule="auto"/>
         <w:ind w:left="259" w:hanging="173"/>
-      </w:pPr>
-      <w:r>
-        <w:rPr>
+        <w:rPr>
+          <w:rFonts w:ascii="Arial" w:hAnsi="Arial" w:cs="Arial"/>
+        </w:rPr>
+      </w:pPr>
+      <w:r>
+        <w:rPr>
+          <w:rFonts w:ascii="Arial" w:hAnsi="Arial" w:cs="Arial"/>
           <w:color w:val="000000"/>
         </w:rPr>
         <w:t>Performed 100+ code reviews and engineering-quality improvements, reducing production defects by 20% and improving code quality by 25%.</w:t>
@@ -1336,9 +1705,13 @@
         </w:pBdr>
         <w:spacing w:after="20" w:line="240" w:lineRule="auto"/>
         <w:ind w:left="259" w:hanging="173"/>
-      </w:pPr>
-      <w:r>
-        <w:rPr>
+        <w:rPr>
+          <w:rFonts w:ascii="Arial" w:hAnsi="Arial" w:cs="Arial"/>
+        </w:rPr>
+      </w:pPr>
+      <w:r>
+        <w:rPr>
+          <w:rFonts w:ascii="Arial" w:hAnsi="Arial" w:cs="Arial"/>
           <w:color w:val="000000"/>
         </w:rPr>
         <w:t>Identified and implemented 10+ architecture optimizations, reducing system latency by 25% and improving overall reliability by 20%.</w:t>
@@ -1347,9 +1720,13 @@
     <w:p>
       <w:pPr>
         <w:spacing w:before="60" w:after="0"/>
-      </w:pPr>
-      <w:r>
-        <w:rPr>
+        <w:rPr>
+          <w:rFonts w:ascii="Arial" w:hAnsi="Arial" w:cs="Arial"/>
+        </w:rPr>
+      </w:pPr>
+      <w:r>
+        <w:rPr>
+          <w:rFonts w:ascii="Arial" w:hAnsi="Arial" w:cs="Arial"/>
           <w:b/>
           <w:bCs/>
           <w:sz w:val="20"/>
@@ -1361,9 +1738,13 @@
     <w:p>
       <w:pPr>
         <w:spacing w:after="20"/>
-      </w:pPr>
-      <w:r>
-        <w:rPr>
+        <w:rPr>
+          <w:rFonts w:ascii="Arial" w:hAnsi="Arial" w:cs="Arial"/>
+        </w:rPr>
+      </w:pPr>
+      <w:r>
+        <w:rPr>
+          <w:rFonts w:ascii="Arial" w:hAnsi="Arial" w:cs="Arial"/>
           <w:b/>
           <w:bCs/>
         </w:rPr>
@@ -1385,9 +1766,13 @@
         </w:pBdr>
         <w:spacing w:after="0" w:line="240" w:lineRule="auto"/>
         <w:ind w:left="259" w:hanging="173"/>
-      </w:pPr>
-      <w:r>
-        <w:rPr>
+        <w:rPr>
+          <w:rFonts w:ascii="Arial" w:hAnsi="Arial" w:cs="Arial"/>
+        </w:rPr>
+      </w:pPr>
+      <w:r>
+        <w:rPr>
+          <w:rFonts w:ascii="Arial" w:hAnsi="Arial" w:cs="Arial"/>
           <w:color w:val="000000"/>
         </w:rPr>
         <w:t>Architected and scaled APIs and messaging systems processing 1M+ transactions/messages per day, improving system reliability by 20% and reducing latency by 30%.</w:t>
@@ -1408,9 +1793,13 @@
         </w:pBdr>
         <w:spacing w:after="0" w:line="240" w:lineRule="auto"/>
         <w:ind w:left="259" w:hanging="173"/>
-      </w:pPr>
-      <w:r>
-        <w:rPr>
+        <w:rPr>
+          <w:rFonts w:ascii="Arial" w:hAnsi="Arial" w:cs="Arial"/>
+        </w:rPr>
+      </w:pPr>
+      <w:r>
+        <w:rPr>
+          <w:rFonts w:ascii="Arial" w:hAnsi="Arial" w:cs="Arial"/>
           <w:color w:val="000000"/>
         </w:rPr>
         <w:t>Led delivery across 20+ enterprise integrations/services, increasing backend processing capacity by 40% while supporting high-volume retail workloads.</w:t>
@@ -1431,9 +1820,13 @@
         </w:pBdr>
         <w:spacing w:after="20" w:line="240" w:lineRule="auto"/>
         <w:ind w:left="259" w:hanging="173"/>
-      </w:pPr>
-      <w:r>
-        <w:rPr>
+        <w:rPr>
+          <w:rFonts w:ascii="Arial" w:hAnsi="Arial" w:cs="Arial"/>
+        </w:rPr>
+      </w:pPr>
+      <w:r>
+        <w:rPr>
+          <w:rFonts w:ascii="Arial" w:hAnsi="Arial" w:cs="Arial"/>
           <w:color w:val="000000"/>
         </w:rPr>
         <w:t>Mentored 8+ junior and mid-level engineers through code reviews and technical guidance, reducing recurring defects by 20% and improving engineering standards.</w:t>
@@ -1442,9 +1835,13 @@
     <w:p>
       <w:pPr>
         <w:spacing w:before="60" w:after="0"/>
-      </w:pPr>
-      <w:r>
-        <w:rPr>
+        <w:rPr>
+          <w:rFonts w:ascii="Arial" w:hAnsi="Arial" w:cs="Arial"/>
+        </w:rPr>
+      </w:pPr>
+      <w:r>
+        <w:rPr>
+          <w:rFonts w:ascii="Arial" w:hAnsi="Arial" w:cs="Arial"/>
           <w:b/>
           <w:bCs/>
           <w:sz w:val="20"/>
@@ -1456,9 +1853,13 @@
     <w:p>
       <w:pPr>
         <w:spacing w:after="20"/>
-      </w:pPr>
-      <w:r>
-        <w:rPr>
+        <w:rPr>
+          <w:rFonts w:ascii="Arial" w:hAnsi="Arial" w:cs="Arial"/>
+        </w:rPr>
+      </w:pPr>
+      <w:r>
+        <w:rPr>
+          <w:rFonts w:ascii="Arial" w:hAnsi="Arial" w:cs="Arial"/>
           <w:b/>
           <w:bCs/>
         </w:rPr>
@@ -1480,9 +1881,13 @@
         </w:pBdr>
         <w:spacing w:after="0" w:line="240" w:lineRule="auto"/>
         <w:ind w:left="259" w:hanging="173"/>
-      </w:pPr>
-      <w:r>
-        <w:rPr>
+        <w:rPr>
+          <w:rFonts w:ascii="Arial" w:hAnsi="Arial" w:cs="Arial"/>
+        </w:rPr>
+      </w:pPr>
+      <w:r>
+        <w:rPr>
+          <w:rFonts w:ascii="Arial" w:hAnsi="Arial" w:cs="Arial"/>
           <w:color w:val="000000"/>
         </w:rPr>
         <w:t>Optimized database and backend services supporting 1M+ users/transactions, reducing average query/API response time by 30% and improving application responsiveness by 25%.</w:t>
@@ -1503,9 +1908,13 @@
         </w:pBdr>
         <w:spacing w:after="0" w:line="240" w:lineRule="auto"/>
         <w:ind w:left="259" w:hanging="173"/>
-      </w:pPr>
-      <w:r>
-        <w:rPr>
+        <w:rPr>
+          <w:rFonts w:ascii="Arial" w:hAnsi="Arial" w:cs="Arial"/>
+        </w:rPr>
+      </w:pPr>
+      <w:r>
+        <w:rPr>
+          <w:rFonts w:ascii="Arial" w:hAnsi="Arial" w:cs="Arial"/>
           <w:color w:val="000000"/>
         </w:rPr>
         <w:t>Reduced production issues by 25% through improved error handling, diagnostics, and backend reliability practices.</w:t>
@@ -1526,9 +1935,13 @@
         </w:pBdr>
         <w:spacing w:after="20" w:line="240" w:lineRule="auto"/>
         <w:ind w:left="259" w:hanging="173"/>
-      </w:pPr>
-      <w:r>
-        <w:rPr>
+        <w:rPr>
+          <w:rFonts w:ascii="Arial" w:hAnsi="Arial" w:cs="Arial"/>
+        </w:rPr>
+      </w:pPr>
+      <w:r>
+        <w:rPr>
+          <w:rFonts w:ascii="Arial" w:hAnsi="Arial" w:cs="Arial"/>
           <w:color w:val="000000"/>
         </w:rPr>
         <w:t>Delivered 20+ backend enhancements and performance improvements, reducing operational/manual effort by 40+ hours per month.</w:t>
@@ -1537,9 +1950,13 @@
     <w:p>
       <w:pPr>
         <w:spacing w:before="60" w:after="0"/>
-      </w:pPr>
-      <w:r>
-        <w:rPr>
+        <w:rPr>
+          <w:rFonts w:ascii="Arial" w:hAnsi="Arial" w:cs="Arial"/>
+        </w:rPr>
+      </w:pPr>
+      <w:r>
+        <w:rPr>
+          <w:rFonts w:ascii="Arial" w:hAnsi="Arial" w:cs="Arial"/>
           <w:b/>
           <w:bCs/>
           <w:sz w:val="20"/>
@@ -1551,9 +1968,13 @@
     <w:p>
       <w:pPr>
         <w:spacing w:after="20"/>
-      </w:pPr>
-      <w:r>
-        <w:rPr>
+        <w:rPr>
+          <w:rFonts w:ascii="Arial" w:hAnsi="Arial" w:cs="Arial"/>
+        </w:rPr>
+      </w:pPr>
+      <w:r>
+        <w:rPr>
+          <w:rFonts w:ascii="Arial" w:hAnsi="Arial" w:cs="Arial"/>
           <w:b/>
           <w:bCs/>
         </w:rPr>
@@ -1575,9 +1996,13 @@
         </w:pBdr>
         <w:spacing w:after="0" w:line="240" w:lineRule="auto"/>
         <w:ind w:left="259" w:hanging="173"/>
-      </w:pPr>
-      <w:r>
-        <w:rPr>
+        <w:rPr>
+          <w:rFonts w:ascii="Arial" w:hAnsi="Arial" w:cs="Arial"/>
+        </w:rPr>
+      </w:pPr>
+      <w:r>
+        <w:rPr>
+          <w:rFonts w:ascii="Arial" w:hAnsi="Arial" w:cs="Arial"/>
           <w:color w:val="000000"/>
         </w:rPr>
         <w:t>Engineered workforce-management solutions using ASP.NET and SQL Server for 20+ enterprise clients and 100K+ users, improving system performance by 20% and supporting 50+ business workflows.</w:t>
@@ -1598,9 +2023,13 @@
         </w:pBdr>
         <w:spacing w:after="0" w:line="240" w:lineRule="auto"/>
         <w:ind w:left="259" w:hanging="173"/>
-      </w:pPr>
-      <w:r>
-        <w:rPr>
+        <w:rPr>
+          <w:rFonts w:ascii="Arial" w:hAnsi="Arial" w:cs="Arial"/>
+        </w:rPr>
+      </w:pPr>
+      <w:r>
+        <w:rPr>
+          <w:rFonts w:ascii="Arial" w:hAnsi="Arial" w:cs="Arial"/>
           <w:color w:val="000000"/>
         </w:rPr>
         <w:t>Developed 15+ scheduling/workforce modules that reduced manual effort by 40+ hours per month and improved scheduling efficiency by 30%.</w:t>
@@ -1621,9 +2050,13 @@
         </w:pBdr>
         <w:spacing w:after="20" w:line="240" w:lineRule="auto"/>
         <w:ind w:left="259" w:hanging="173"/>
-      </w:pPr>
-      <w:r>
-        <w:rPr>
+        <w:rPr>
+          <w:rFonts w:ascii="Arial" w:hAnsi="Arial" w:cs="Arial"/>
+        </w:rPr>
+      </w:pPr>
+      <w:r>
+        <w:rPr>
+          <w:rFonts w:ascii="Arial" w:hAnsi="Arial" w:cs="Arial"/>
           <w:color w:val="000000"/>
         </w:rPr>
         <w:t>Collaborated with 15+ business and technical stakeholders to deliver 30+ enhancements, improving delivery efficiency by 25% and supporting successful project outcomes.</w:t>
@@ -1632,56 +2065,145 @@
     <w:p>
       <w:pPr>
         <w:spacing w:before="100" w:after="60"/>
-      </w:pPr>
-      <w:r>
-        <w:rPr>
+        <w:rPr>
+          <w:rFonts w:ascii="Arial" w:hAnsi="Arial" w:cs="Arial"/>
+        </w:rPr>
+      </w:pPr>
+      <w:r>
+        <w:rPr>
+          <w:rFonts w:ascii="Arial" w:hAnsi="Arial" w:cs="Arial"/>
           <w:b/>
           <w:bCs/>
           <w:sz w:val="22"/>
           <w:szCs w:val="22"/>
         </w:rPr>
-        <w:t>EDUCATION</w:t>
-      </w:r>
-    </w:p>
-    <w:p>
-      <w:pPr>
-        <w:spacing w:after="20"/>
-      </w:pPr>
-      <w:proofErr w:type="spellStart"/>
-      <w:proofErr w:type="gramStart"/>
-      <w:r>
-        <w:rPr>
-          <w:b/>
-          <w:bCs/>
-        </w:rPr>
-        <w:t>B.Tech</w:t>
-      </w:r>
-      <w:proofErr w:type="spellEnd"/>
-      <w:proofErr w:type="gramEnd"/>
-      <w:r>
-        <w:rPr>
-          <w:b/>
-          <w:bCs/>
-        </w:rPr>
-        <w:t>: Information Technology, 01/2010</w:t>
-      </w:r>
-    </w:p>
-    <w:p>
-      <w:pPr>
-        <w:spacing w:after="60"/>
-      </w:pPr>
-      <w:r>
-        <w:rPr>
-          <w:b/>
-          <w:bCs/>
-        </w:rPr>
-        <w:t>V.R. Siddhartha Engineering College - Vijayawada</w:t>
+        <w:t>CERTIFICATIONS</w:t>
+      </w:r>
+    </w:p>
+    <w:p>
+      <w:pPr>
+        <w:numPr>
+          <w:ilvl w:val="0"/>
+          <w:numId w:val="1"/>
+        </w:numPr>
+        <w:pBdr>
+          <w:top w:val="nil"/>
+          <w:left w:val="nil"/>
+          <w:bottom w:val="nil"/>
+          <w:right w:val="nil"/>
+          <w:between w:val="nil"/>
+        </w:pBdr>
+        <w:spacing w:after="0" w:line="240" w:lineRule="auto"/>
+        <w:ind w:left="259" w:hanging="173"/>
+        <w:rPr>
+          <w:rFonts w:ascii="Arial" w:hAnsi="Arial" w:cs="Arial"/>
+          <w:color w:val="000000"/>
+        </w:rPr>
+      </w:pPr>
+      <w:r>
+        <w:rPr>
+          <w:rFonts w:ascii="Arial" w:hAnsi="Arial" w:cs="Arial"/>
+          <w:color w:val="000000"/>
+        </w:rPr>
+        <w:t xml:space="preserve">AWS Certified Solutions Architect – Associate | </w:t>
+      </w:r>
+      <w:r>
+        <w:rPr>
+          <w:rFonts w:ascii="Arial" w:hAnsi="Arial" w:cs="Arial"/>
+          <w:color w:val="000000"/>
+        </w:rPr>
+        <w:t>2024</w:t>
+      </w:r>
+    </w:p>
+    <w:p>
+      <w:pPr>
+        <w:numPr>
+          <w:ilvl w:val="0"/>
+          <w:numId w:val="1"/>
+        </w:numPr>
+        <w:pBdr>
+          <w:top w:val="nil"/>
+          <w:left w:val="nil"/>
+          <w:bottom w:val="nil"/>
+          <w:right w:val="nil"/>
+          <w:between w:val="nil"/>
+        </w:pBdr>
+        <w:spacing w:after="0" w:line="240" w:lineRule="auto"/>
+        <w:ind w:left="259" w:hanging="173"/>
+        <w:rPr>
+          <w:rFonts w:ascii="Arial" w:hAnsi="Arial" w:cs="Arial"/>
+          <w:color w:val="000000"/>
+        </w:rPr>
+      </w:pPr>
+      <w:r>
+        <w:rPr>
+          <w:rFonts w:ascii="Arial" w:hAnsi="Arial" w:cs="Arial"/>
+          <w:color w:val="000000"/>
+        </w:rPr>
+        <w:t xml:space="preserve">Coursera: Application Development using Microservices and Serverless | </w:t>
+      </w:r>
+      <w:r>
+        <w:rPr>
+          <w:rFonts w:ascii="Arial" w:hAnsi="Arial" w:cs="Arial"/>
+          <w:color w:val="000000"/>
+        </w:rPr>
+        <w:t>2020</w:t>
+      </w:r>
+    </w:p>
+    <w:p>
+      <w:pPr>
+        <w:numPr>
+          <w:ilvl w:val="0"/>
+          <w:numId w:val="1"/>
+        </w:numPr>
+        <w:pBdr>
+          <w:top w:val="nil"/>
+          <w:left w:val="nil"/>
+          <w:bottom w:val="nil"/>
+          <w:right w:val="nil"/>
+          <w:between w:val="nil"/>
+        </w:pBdr>
+        <w:spacing w:after="0" w:line="240" w:lineRule="auto"/>
+        <w:ind w:left="259" w:hanging="173"/>
+        <w:rPr>
+          <w:rFonts w:ascii="Arial" w:hAnsi="Arial" w:cs="Arial"/>
+          <w:color w:val="000000"/>
+        </w:rPr>
+      </w:pPr>
+      <w:r>
+        <w:rPr>
+          <w:rFonts w:ascii="Arial" w:hAnsi="Arial" w:cs="Arial"/>
+          <w:color w:val="000000"/>
+        </w:rPr>
+        <w:t xml:space="preserve">Microsoft Certified: </w:t>
+      </w:r>
+      <w:r>
+        <w:rPr>
+          <w:rFonts w:ascii="Arial" w:hAnsi="Arial" w:cs="Arial"/>
+          <w:color w:val="000000"/>
+        </w:rPr>
+        <w:t xml:space="preserve">.NET </w:t>
+      </w:r>
+      <w:r>
+        <w:rPr>
+          <w:rFonts w:ascii="Arial" w:hAnsi="Arial" w:cs="Arial"/>
+          <w:color w:val="000000"/>
+        </w:rPr>
+        <w:t xml:space="preserve">Developer Associate | </w:t>
+      </w:r>
+      <w:r>
+        <w:rPr>
+          <w:rFonts w:ascii="Arial" w:hAnsi="Arial" w:cs="Arial"/>
+          <w:color w:val="000000"/>
+        </w:rPr>
+        <w:t>2016</w:t>
       </w:r>
     </w:p>
     <w:p>
       <w:pPr>
         <w:spacing w:before="100" w:after="60"/>
         <w:rPr>
+          <w:rFonts w:ascii="Arial" w:hAnsi="Arial" w:cs="Arial"/>
           <w:b/>
           <w:bCs/>
           <w:sz w:val="22"/>
@@ -1693,36 +2215,80 @@
       <w:pPr>
         <w:spacing w:before="100" w:after="60"/>
         <w:rPr>
+          <w:rFonts w:ascii="Arial" w:hAnsi="Arial" w:cs="Arial"/>
+        </w:rPr>
+      </w:pPr>
+      <w:r>
+        <w:rPr>
+          <w:rFonts w:ascii="Arial" w:hAnsi="Arial" w:cs="Arial"/>
           <w:b/>
           <w:bCs/>
           <w:sz w:val="22"/>
           <w:szCs w:val="22"/>
         </w:rPr>
-      </w:pPr>
+        <w:lastRenderedPageBreak/>
+        <w:t>EDUCATION</w:t>
+      </w:r>
+    </w:p>
+    <w:p>
+      <w:pPr>
+        <w:spacing w:after="20"/>
+        <w:rPr>
+          <w:rFonts w:ascii="Arial" w:hAnsi="Arial" w:cs="Arial"/>
+        </w:rPr>
+      </w:pPr>
+      <w:proofErr w:type="spellStart"/>
+      <w:proofErr w:type="gramStart"/>
+      <w:r>
+        <w:rPr>
+          <w:rFonts w:ascii="Arial" w:hAnsi="Arial" w:cs="Arial"/>
+          <w:b/>
+          <w:bCs/>
+        </w:rPr>
+        <w:t>B.Tech</w:t>
+      </w:r>
+      <w:proofErr w:type="spellEnd"/>
+      <w:proofErr w:type="gramEnd"/>
+      <w:r>
+        <w:rPr>
+          <w:rFonts w:ascii="Arial" w:hAnsi="Arial" w:cs="Arial"/>
+          <w:b/>
+          <w:bCs/>
+        </w:rPr>
+        <w:t>: Information Technology, 01/2010</w:t>
+      </w:r>
+    </w:p>
+    <w:p>
+      <w:pPr>
+        <w:spacing w:after="60"/>
+        <w:rPr>
+          <w:rFonts w:ascii="Arial" w:hAnsi="Arial" w:cs="Arial"/>
+        </w:rPr>
+      </w:pPr>
+      <w:r>
+        <w:rPr>
+          <w:rFonts w:ascii="Arial" w:hAnsi="Arial" w:cs="Arial"/>
+          <w:b/>
+          <w:bCs/>
+        </w:rPr>
+        <w:t>V.R. Siddhartha Engineering College - Vijayawada</w:t>
+      </w:r>
     </w:p>
     <w:p>
       <w:pPr>
         <w:spacing w:before="100" w:after="60"/>
         <w:rPr>
+          <w:rFonts w:ascii="Arial" w:hAnsi="Arial" w:cs="Arial"/>
+        </w:rPr>
+      </w:pPr>
+      <w:r>
+        <w:rPr>
+          <w:rFonts w:ascii="Arial" w:hAnsi="Arial" w:cs="Arial"/>
           <w:b/>
           <w:bCs/>
           <w:sz w:val="22"/>
           <w:szCs w:val="22"/>
         </w:rPr>
-      </w:pPr>
-    </w:p>
-    <w:p>
-      <w:pPr>
-        <w:spacing w:before="100" w:after="60"/>
-      </w:pPr>
-      <w:r>
-        <w:rPr>
-          <w:b/>
-          <w:bCs/>
-          <w:sz w:val="22"/>
-          <w:szCs w:val="22"/>
-        </w:rPr>
-        <w:lastRenderedPageBreak/>
         <w:t>CORE TECHNICAL COMPETENCIES</w:t>
       </w:r>
     </w:p>
@@ -1741,9 +2307,13 @@
         </w:pBdr>
         <w:spacing w:after="0" w:line="240" w:lineRule="auto"/>
         <w:ind w:left="259" w:hanging="173"/>
-      </w:pPr>
-      <w:r>
-        <w:rPr>
+        <w:rPr>
+          <w:rFonts w:ascii="Arial" w:hAnsi="Arial" w:cs="Arial"/>
+        </w:rPr>
+      </w:pPr>
+      <w:r>
+        <w:rPr>
+          <w:rFonts w:ascii="Arial" w:hAnsi="Arial" w:cs="Arial"/>
           <w:color w:val="000000"/>
         </w:rPr>
         <w:t>System &amp; Distributed Systems Design</w:t>
@@ -1764,9 +2334,13 @@
         </w:pBdr>
         <w:spacing w:after="0" w:line="240" w:lineRule="auto"/>
         <w:ind w:left="259" w:hanging="173"/>
-      </w:pPr>
-      <w:r>
-        <w:rPr>
+        <w:rPr>
+          <w:rFonts w:ascii="Arial" w:hAnsi="Arial" w:cs="Arial"/>
+        </w:rPr>
+      </w:pPr>
+      <w:r>
+        <w:rPr>
+          <w:rFonts w:ascii="Arial" w:hAnsi="Arial" w:cs="Arial"/>
           <w:color w:val="000000"/>
         </w:rPr>
         <w:t>Microservices Architecture</w:t>
@@ -1787,9 +2361,13 @@
         </w:pBdr>
         <w:spacing w:after="0" w:line="240" w:lineRule="auto"/>
         <w:ind w:left="259" w:hanging="173"/>
-      </w:pPr>
-      <w:r>
-        <w:rPr>
+        <w:rPr>
+          <w:rFonts w:ascii="Arial" w:hAnsi="Arial" w:cs="Arial"/>
+        </w:rPr>
+      </w:pPr>
+      <w:r>
+        <w:rPr>
+          <w:rFonts w:ascii="Arial" w:hAnsi="Arial" w:cs="Arial"/>
           <w:color w:val="000000"/>
         </w:rPr>
         <w:t>API &amp; Integration Design</w:t>
@@ -1810,9 +2388,13 @@
         </w:pBdr>
         <w:spacing w:after="0" w:line="240" w:lineRule="auto"/>
         <w:ind w:left="259" w:hanging="173"/>
-      </w:pPr>
-      <w:r>
-        <w:rPr>
+        <w:rPr>
+          <w:rFonts w:ascii="Arial" w:hAnsi="Arial" w:cs="Arial"/>
+        </w:rPr>
+      </w:pPr>
+      <w:r>
+        <w:rPr>
+          <w:rFonts w:ascii="Arial" w:hAnsi="Arial" w:cs="Arial"/>
           <w:color w:val="000000"/>
         </w:rPr>
         <w:t>Event-Driven Architecture (Kafka, RabbitMQ)</w:t>
@@ -1833,9 +2415,13 @@
         </w:pBdr>
         <w:spacing w:after="0" w:line="240" w:lineRule="auto"/>
         <w:ind w:left="259" w:hanging="173"/>
-      </w:pPr>
-      <w:r>
-        <w:rPr>
+        <w:rPr>
+          <w:rFonts w:ascii="Arial" w:hAnsi="Arial" w:cs="Arial"/>
+        </w:rPr>
+      </w:pPr>
+      <w:r>
+        <w:rPr>
+          <w:rFonts w:ascii="Arial" w:hAnsi="Arial" w:cs="Arial"/>
           <w:color w:val="000000"/>
         </w:rPr>
         <w:t>Domain-Driven Design</w:t>
@@ -1856,9 +2442,13 @@
         </w:pBdr>
         <w:spacing w:after="0" w:line="240" w:lineRule="auto"/>
         <w:ind w:left="259" w:hanging="173"/>
-      </w:pPr>
-      <w:r>
-        <w:rPr>
+        <w:rPr>
+          <w:rFonts w:ascii="Arial" w:hAnsi="Arial" w:cs="Arial"/>
+        </w:rPr>
+      </w:pPr>
+      <w:r>
+        <w:rPr>
+          <w:rFonts w:ascii="Arial" w:hAnsi="Arial" w:cs="Arial"/>
           <w:color w:val="000000"/>
         </w:rPr>
         <w:t>Design Patterns</w:t>
@@ -1879,9 +2469,13 @@
         </w:pBdr>
         <w:spacing w:after="0" w:line="240" w:lineRule="auto"/>
         <w:ind w:left="259" w:hanging="173"/>
-      </w:pPr>
-      <w:r>
-        <w:rPr>
+        <w:rPr>
+          <w:rFonts w:ascii="Arial" w:hAnsi="Arial" w:cs="Arial"/>
+        </w:rPr>
+      </w:pPr>
+      <w:r>
+        <w:rPr>
+          <w:rFonts w:ascii="Arial" w:hAnsi="Arial" w:cs="Arial"/>
           <w:color w:val="000000"/>
         </w:rPr>
         <w:t>Non-Functional Requirements (Scalability, Reliability, Performance)</w:t>
@@ -1902,9 +2496,13 @@
         </w:pBdr>
         <w:spacing w:after="0" w:line="240" w:lineRule="auto"/>
         <w:ind w:left="259" w:hanging="173"/>
-      </w:pPr>
-      <w:r>
-        <w:rPr>
+        <w:rPr>
+          <w:rFonts w:ascii="Arial" w:hAnsi="Arial" w:cs="Arial"/>
+        </w:rPr>
+      </w:pPr>
+      <w:r>
+        <w:rPr>
+          <w:rFonts w:ascii="Arial" w:hAnsi="Arial" w:cs="Arial"/>
           <w:color w:val="000000"/>
         </w:rPr>
         <w:t>Cloud Architecture (AWS, Azure)</w:t>
@@ -1925,9 +2523,13 @@
         </w:pBdr>
         <w:spacing w:after="0" w:line="240" w:lineRule="auto"/>
         <w:ind w:left="259" w:hanging="173"/>
-      </w:pPr>
-      <w:r>
-        <w:rPr>
+        <w:rPr>
+          <w:rFonts w:ascii="Arial" w:hAnsi="Arial" w:cs="Arial"/>
+        </w:rPr>
+      </w:pPr>
+      <w:r>
+        <w:rPr>
+          <w:rFonts w:ascii="Arial" w:hAnsi="Arial" w:cs="Arial"/>
           <w:color w:val="000000"/>
         </w:rPr>
         <w:t>Containerization &amp; Orchestration (Docker, Kubernetes)</w:t>
@@ -1948,9 +2550,13 @@
         </w:pBdr>
         <w:spacing w:after="0" w:line="240" w:lineRule="auto"/>
         <w:ind w:left="259" w:hanging="173"/>
-      </w:pPr>
-      <w:r>
-        <w:rPr>
+        <w:rPr>
+          <w:rFonts w:ascii="Arial" w:hAnsi="Arial" w:cs="Arial"/>
+        </w:rPr>
+      </w:pPr>
+      <w:r>
+        <w:rPr>
+          <w:rFonts w:ascii="Arial" w:hAnsi="Arial" w:cs="Arial"/>
           <w:color w:val="000000"/>
         </w:rPr>
         <w:t>CI/CD (Jenkins, Git)</w:t>
@@ -1971,9 +2577,13 @@
         </w:pBdr>
         <w:spacing w:after="0" w:line="240" w:lineRule="auto"/>
         <w:ind w:left="259" w:hanging="173"/>
-      </w:pPr>
-      <w:r>
-        <w:rPr>
+        <w:rPr>
+          <w:rFonts w:ascii="Arial" w:hAnsi="Arial" w:cs="Arial"/>
+        </w:rPr>
+      </w:pPr>
+      <w:r>
+        <w:rPr>
+          <w:rFonts w:ascii="Arial" w:hAnsi="Arial" w:cs="Arial"/>
           <w:color w:val="000000"/>
         </w:rPr>
         <w:t>High Availability &amp; Disaster Recovery</w:t>
@@ -1994,9 +2604,13 @@
         </w:pBdr>
         <w:spacing w:after="0" w:line="240" w:lineRule="auto"/>
         <w:ind w:left="259" w:hanging="173"/>
-      </w:pPr>
-      <w:r>
-        <w:rPr>
+        <w:rPr>
+          <w:rFonts w:ascii="Arial" w:hAnsi="Arial" w:cs="Arial"/>
+        </w:rPr>
+      </w:pPr>
+      <w:r>
+        <w:rPr>
+          <w:rFonts w:ascii="Arial" w:hAnsi="Arial" w:cs="Arial"/>
           <w:color w:val="000000"/>
         </w:rPr>
         <w:t>.NET Core / ASP.NET Core</w:t>
@@ -2017,9 +2631,13 @@
         </w:pBdr>
         <w:spacing w:after="0" w:line="240" w:lineRule="auto"/>
         <w:ind w:left="259" w:hanging="173"/>
-      </w:pPr>
-      <w:r>
-        <w:rPr>
+        <w:rPr>
+          <w:rFonts w:ascii="Arial" w:hAnsi="Arial" w:cs="Arial"/>
+        </w:rPr>
+      </w:pPr>
+      <w:r>
+        <w:rPr>
+          <w:rFonts w:ascii="Arial" w:hAnsi="Arial" w:cs="Arial"/>
           <w:color w:val="000000"/>
         </w:rPr>
         <w:t>C#</w:t>
@@ -2040,9 +2658,13 @@
         </w:pBdr>
         <w:spacing w:after="0" w:line="240" w:lineRule="auto"/>
         <w:ind w:left="259" w:hanging="173"/>
-      </w:pPr>
-      <w:r>
-        <w:rPr>
+        <w:rPr>
+          <w:rFonts w:ascii="Arial" w:hAnsi="Arial" w:cs="Arial"/>
+        </w:rPr>
+      </w:pPr>
+      <w:r>
+        <w:rPr>
+          <w:rFonts w:ascii="Arial" w:hAnsi="Arial" w:cs="Arial"/>
           <w:color w:val="000000"/>
         </w:rPr>
         <w:t>Entity Framework</w:t>
@@ -2063,9 +2685,13 @@
         </w:pBdr>
         <w:spacing w:after="0" w:line="240" w:lineRule="auto"/>
         <w:ind w:left="259" w:hanging="173"/>
-      </w:pPr>
-      <w:r>
-        <w:rPr>
+        <w:rPr>
+          <w:rFonts w:ascii="Arial" w:hAnsi="Arial" w:cs="Arial"/>
+        </w:rPr>
+      </w:pPr>
+      <w:r>
+        <w:rPr>
+          <w:rFonts w:ascii="Arial" w:hAnsi="Arial" w:cs="Arial"/>
           <w:color w:val="000000"/>
         </w:rPr>
         <w:t>LINQ</w:t>
@@ -2086,9 +2712,13 @@
         </w:pBdr>
         <w:spacing w:after="0" w:line="240" w:lineRule="auto"/>
         <w:ind w:left="259" w:hanging="173"/>
-      </w:pPr>
-      <w:r>
-        <w:rPr>
+        <w:rPr>
+          <w:rFonts w:ascii="Arial" w:hAnsi="Arial" w:cs="Arial"/>
+        </w:rPr>
+      </w:pPr>
+      <w:r>
+        <w:rPr>
+          <w:rFonts w:ascii="Arial" w:hAnsi="Arial" w:cs="Arial"/>
           <w:color w:val="000000"/>
         </w:rPr>
         <w:t>React</w:t>
@@ -2109,9 +2739,13 @@
         </w:pBdr>
         <w:spacing w:after="0" w:line="240" w:lineRule="auto"/>
         <w:ind w:left="259" w:hanging="173"/>
-      </w:pPr>
-      <w:r>
-        <w:rPr>
+        <w:rPr>
+          <w:rFonts w:ascii="Arial" w:hAnsi="Arial" w:cs="Arial"/>
+        </w:rPr>
+      </w:pPr>
+      <w:r>
+        <w:rPr>
+          <w:rFonts w:ascii="Arial" w:hAnsi="Arial" w:cs="Arial"/>
           <w:color w:val="000000"/>
         </w:rPr>
         <w:t>Angular</w:t>
@@ -2132,9 +2766,67 @@
         </w:pBdr>
         <w:spacing w:after="0" w:line="240" w:lineRule="auto"/>
         <w:ind w:left="259" w:hanging="173"/>
-      </w:pPr>
-      <w:r>
-        <w:rPr>
+        <w:rPr>
+          <w:rFonts w:ascii="Arial" w:hAnsi="Arial" w:cs="Arial"/>
+        </w:rPr>
+      </w:pPr>
+      <w:r>
+        <w:rPr>
+          <w:rFonts w:ascii="Arial" w:hAnsi="Arial" w:cs="Arial"/>
+          <w:color w:val="000000"/>
+        </w:rPr>
+        <w:t>OOPS</w:t>
+      </w:r>
+    </w:p>
+    <w:p>
+      <w:pPr>
+        <w:numPr>
+          <w:ilvl w:val="0"/>
+          <w:numId w:val="1"/>
+        </w:numPr>
+        <w:pBdr>
+          <w:top w:val="nil"/>
+          <w:left w:val="nil"/>
+          <w:bottom w:val="nil"/>
+          <w:right w:val="nil"/>
+          <w:between w:val="nil"/>
+        </w:pBdr>
+        <w:spacing w:after="0" w:line="240" w:lineRule="auto"/>
+        <w:ind w:left="259" w:hanging="173"/>
+        <w:rPr>
+          <w:rFonts w:ascii="Arial" w:hAnsi="Arial" w:cs="Arial"/>
+        </w:rPr>
+      </w:pPr>
+      <w:r>
+        <w:rPr>
+          <w:rFonts w:ascii="Arial" w:hAnsi="Arial" w:cs="Arial"/>
+          <w:color w:val="000000"/>
+        </w:rPr>
+        <w:t>Solid Principles</w:t>
+      </w:r>
+    </w:p>
+    <w:p>
+      <w:pPr>
+        <w:numPr>
+          <w:ilvl w:val="0"/>
+          <w:numId w:val="1"/>
+        </w:numPr>
+        <w:pBdr>
+          <w:top w:val="nil"/>
+          <w:left w:val="nil"/>
+          <w:bottom w:val="nil"/>
+          <w:right w:val="nil"/>
+          <w:between w:val="nil"/>
+        </w:pBdr>
+        <w:spacing w:after="0" w:line="240" w:lineRule="auto"/>
+        <w:ind w:left="259" w:hanging="173"/>
+        <w:rPr>
+          <w:rFonts w:ascii="Arial" w:hAnsi="Arial" w:cs="Arial"/>
+        </w:rPr>
+      </w:pPr>
+      <w:r>
+        <w:rPr>
+          <w:rFonts w:ascii="Arial" w:hAnsi="Arial" w:cs="Arial"/>
           <w:color w:val="000000"/>
         </w:rPr>
         <w:t>SQL Server</w:t>
@@ -2155,9 +2847,13 @@
         </w:pBdr>
         <w:spacing w:after="0" w:line="240" w:lineRule="auto"/>
         <w:ind w:left="259" w:hanging="173"/>
-      </w:pPr>
-      <w:r>
-        <w:rPr>
+        <w:rPr>
+          <w:rFonts w:ascii="Arial" w:hAnsi="Arial" w:cs="Arial"/>
+        </w:rPr>
+      </w:pPr>
+      <w:r>
+        <w:rPr>
+          <w:rFonts w:ascii="Arial" w:hAnsi="Arial" w:cs="Arial"/>
           <w:color w:val="000000"/>
         </w:rPr>
         <w:t>PostgreSQL</w:t>
@@ -2178,9 +2874,13 @@
         </w:pBdr>
         <w:spacing w:after="0" w:line="240" w:lineRule="auto"/>
         <w:ind w:left="259" w:hanging="173"/>
-      </w:pPr>
-      <w:r>
-        <w:rPr>
+        <w:rPr>
+          <w:rFonts w:ascii="Arial" w:hAnsi="Arial" w:cs="Arial"/>
+        </w:rPr>
+      </w:pPr>
+      <w:r>
+        <w:rPr>
+          <w:rFonts w:ascii="Arial" w:hAnsi="Arial" w:cs="Arial"/>
           <w:color w:val="000000"/>
         </w:rPr>
         <w:t>REST API Design</w:t>
@@ -2201,32 +2901,40 @@
         </w:pBdr>
         <w:spacing w:after="0" w:line="240" w:lineRule="auto"/>
         <w:ind w:left="259" w:hanging="173"/>
-      </w:pPr>
-      <w:r>
-        <w:rPr>
-          <w:color w:val="000000"/>
-        </w:rPr>
-        <w:t>Technical Standards &amp; Governance</w:t>
-      </w:r>
-    </w:p>
-    <w:p>
-      <w:pPr>
-        <w:numPr>
-          <w:ilvl w:val="0"/>
-          <w:numId w:val="1"/>
-        </w:numPr>
-        <w:pBdr>
-          <w:top w:val="nil"/>
-          <w:left w:val="nil"/>
-          <w:bottom w:val="nil"/>
-          <w:right w:val="nil"/>
-          <w:between w:val="nil"/>
-        </w:pBdr>
-        <w:spacing w:after="0" w:line="240" w:lineRule="auto"/>
-        <w:ind w:left="259" w:hanging="173"/>
-      </w:pPr>
-      <w:r>
-        <w:rPr>
+        <w:rPr>
+          <w:rFonts w:ascii="Arial" w:hAnsi="Arial" w:cs="Arial"/>
+        </w:rPr>
+      </w:pPr>
+      <w:r>
+        <w:rPr>
+          <w:rFonts w:ascii="Arial" w:hAnsi="Arial" w:cs="Arial"/>
+          <w:color w:val="000000"/>
+        </w:rPr>
+        <w:t>Technical Standards &amp; Governance • AI-Assisted Development (Cursor, Claude, GitHub Copilot)</w:t>
+      </w:r>
+    </w:p>
+    <w:p>
+      <w:pPr>
+        <w:numPr>
+          <w:ilvl w:val="0"/>
+          <w:numId w:val="1"/>
+        </w:numPr>
+        <w:pBdr>
+          <w:top w:val="nil"/>
+          <w:left w:val="nil"/>
+          <w:bottom w:val="nil"/>
+          <w:right w:val="nil"/>
+          <w:between w:val="nil"/>
+        </w:pBdr>
+        <w:spacing w:after="0" w:line="240" w:lineRule="auto"/>
+        <w:ind w:left="259" w:hanging="173"/>
+        <w:rPr>
+          <w:rFonts w:ascii="Arial" w:hAnsi="Arial" w:cs="Arial"/>
+        </w:rPr>
+      </w:pPr>
+      <w:r>
+        <w:rPr>
+          <w:rFonts w:ascii="Arial" w:hAnsi="Arial" w:cs="Arial"/>
           <w:color w:val="000000"/>
         </w:rPr>
         <w:t>Code Reviews &amp; Mentoring</w:t>
@@ -2247,9 +2955,13 @@
         </w:pBdr>
         <w:spacing w:after="0" w:line="240" w:lineRule="auto"/>
         <w:ind w:left="259" w:hanging="173"/>
-      </w:pPr>
-      <w:r>
-        <w:rPr>
+        <w:rPr>
+          <w:rFonts w:ascii="Arial" w:hAnsi="Arial" w:cs="Arial"/>
+        </w:rPr>
+      </w:pPr>
+      <w:r>
+        <w:rPr>
+          <w:rFonts w:ascii="Arial" w:hAnsi="Arial" w:cs="Arial"/>
           <w:color w:val="000000"/>
         </w:rPr>
         <w:t>Cross-Team Architecture Alignment</w:t>
@@ -2270,9 +2982,13 @@
         </w:pBdr>
         <w:spacing w:after="0" w:line="240" w:lineRule="auto"/>
         <w:ind w:left="259" w:hanging="173"/>
-      </w:pPr>
-      <w:r>
-        <w:rPr>
+        <w:rPr>
+          <w:rFonts w:ascii="Arial" w:hAnsi="Arial" w:cs="Arial"/>
+        </w:rPr>
+      </w:pPr>
+      <w:r>
+        <w:rPr>
+          <w:rFonts w:ascii="Arial" w:hAnsi="Arial" w:cs="Arial"/>
           <w:color w:val="000000"/>
         </w:rPr>
         <w:t>Stakeholder Management</w:t>
@@ -2293,9 +3009,13 @@
         </w:pBdr>
         <w:spacing w:after="20" w:line="240" w:lineRule="auto"/>
         <w:ind w:left="259" w:hanging="173"/>
-      </w:pPr>
-      <w:r>
-        <w:rPr>
+        <w:rPr>
+          <w:rFonts w:ascii="Arial" w:hAnsi="Arial" w:cs="Arial"/>
+        </w:rPr>
+      </w:pPr>
+      <w:r>
+        <w:rPr>
+          <w:rFonts w:ascii="Arial" w:hAnsi="Arial" w:cs="Arial"/>
           <w:color w:val="000000"/>
         </w:rPr>
         <w:t>Agile/Scrum Delivery</w:t>

</xml_diff>

<commit_message>
chore(resume): refresh Mohammed_Abdul_Rafi_Ahmed_Resume master base (#247)
Replace owner master resume and sync into canonical Rafi_Resume.docx
(+ Architect alias) for all daily apply portals; JD tailor still runs
on top while upload filename/label stays Rafi_Resume.

Co-authored-by: Cursor Agent <cursoragent@cursor.com>
Co-authored-by: rafi-solibri <rafi-solibri@users.noreply.github.com>
</commit_message>
<xml_diff>
--- a/resumes/Mohammed_Abdul_Rafi_Ahmed_Resume.docx
+++ b/resumes/Mohammed_Abdul_Rafi_Ahmed_Resume.docx
@@ -6,9 +6,13 @@
       <w:pPr>
         <w:spacing w:after="50"/>
         <w:jc w:val="center"/>
-      </w:pPr>
-      <w:r>
-        <w:rPr>
+        <w:rPr>
+          <w:rFonts w:ascii="Arial" w:hAnsi="Arial" w:cs="Arial"/>
+        </w:rPr>
+      </w:pPr>
+      <w:r>
+        <w:rPr>
+          <w:rFonts w:ascii="Arial" w:hAnsi="Arial" w:cs="Arial"/>
           <w:b/>
           <w:bCs/>
           <w:smallCaps/>
@@ -19,6 +23,7 @@
       </w:r>
       <w:r>
         <w:rPr>
+          <w:rFonts w:ascii="Arial" w:hAnsi="Arial" w:cs="Arial"/>
           <w:b/>
           <w:bCs/>
           <w:smallCaps/>
@@ -28,6 +33,9 @@
         <w:br/>
       </w:r>
       <w:r>
+        <w:rPr>
+          <w:rFonts w:ascii="Arial" w:hAnsi="Arial" w:cs="Arial"/>
+        </w:rPr>
         <w:t>Technical Architect | Technical Lead — .NET, Cloud &amp; Distributed Systems</w:t>
       </w:r>
     </w:p>
@@ -35,9 +43,13 @@
       <w:pPr>
         <w:spacing w:after="20"/>
         <w:jc w:val="center"/>
-      </w:pPr>
-      <w:r>
-        <w:rPr>
+        <w:rPr>
+          <w:rFonts w:ascii="Arial" w:hAnsi="Arial" w:cs="Arial"/>
+        </w:rPr>
+      </w:pPr>
+      <w:r>
+        <w:rPr>
+          <w:rFonts w:ascii="Arial" w:hAnsi="Arial" w:cs="Arial"/>
           <w:sz w:val="18"/>
           <w:szCs w:val="18"/>
         </w:rPr>
@@ -45,6 +57,7 @@
       </w:r>
       <w:r>
         <w:rPr>
+          <w:rFonts w:ascii="Arial" w:hAnsi="Arial" w:cs="Arial"/>
           <w:sz w:val="18"/>
           <w:szCs w:val="18"/>
         </w:rPr>
@@ -53,6 +66,7 @@
       <w:proofErr w:type="gramStart"/>
       <w:r>
         <w:rPr>
+          <w:rFonts w:ascii="Arial" w:hAnsi="Arial" w:cs="Arial"/>
           <w:sz w:val="18"/>
           <w:szCs w:val="18"/>
         </w:rPr>
@@ -60,6 +74,7 @@
       </w:r>
       <w:r>
         <w:rPr>
+          <w:rFonts w:ascii="Arial" w:hAnsi="Arial" w:cs="Arial"/>
           <w:sz w:val="18"/>
           <w:szCs w:val="18"/>
         </w:rPr>
@@ -68,6 +83,7 @@
       <w:proofErr w:type="gramEnd"/>
       <w:r>
         <w:rPr>
+          <w:rFonts w:ascii="Arial" w:hAnsi="Arial" w:cs="Arial"/>
           <w:sz w:val="18"/>
           <w:szCs w:val="18"/>
         </w:rPr>
@@ -75,6 +91,7 @@
       </w:r>
       <w:r>
         <w:rPr>
+          <w:rFonts w:ascii="Arial" w:hAnsi="Arial" w:cs="Arial"/>
           <w:sz w:val="18"/>
           <w:szCs w:val="18"/>
         </w:rPr>
@@ -83,6 +100,7 @@
       <w:proofErr w:type="gramStart"/>
       <w:r>
         <w:rPr>
+          <w:rFonts w:ascii="Arial" w:hAnsi="Arial" w:cs="Arial"/>
           <w:sz w:val="18"/>
           <w:szCs w:val="18"/>
         </w:rPr>
@@ -90,6 +108,7 @@
       </w:r>
       <w:r>
         <w:rPr>
+          <w:rFonts w:ascii="Arial" w:hAnsi="Arial" w:cs="Arial"/>
           <w:sz w:val="18"/>
           <w:szCs w:val="18"/>
         </w:rPr>
@@ -101,9 +120,13 @@
       <w:pPr>
         <w:spacing w:after="60"/>
         <w:jc w:val="center"/>
-      </w:pPr>
-      <w:r>
-        <w:rPr>
+        <w:rPr>
+          <w:rFonts w:ascii="Arial" w:hAnsi="Arial" w:cs="Arial"/>
+        </w:rPr>
+      </w:pPr>
+      <w:r>
+        <w:rPr>
+          <w:rFonts w:ascii="Arial" w:hAnsi="Arial" w:cs="Arial"/>
           <w:sz w:val="18"/>
           <w:szCs w:val="18"/>
           <w:u w:val="single"/>
@@ -114,6 +137,7 @@
         <w:r>
           <w:rPr>
             <w:rStyle w:val="Hyperlink"/>
+            <w:rFonts w:ascii="Arial" w:hAnsi="Arial" w:cs="Arial"/>
             <w:sz w:val="18"/>
             <w:szCs w:val="18"/>
           </w:rPr>
@@ -123,6 +147,7 @@
         <w:r>
           <w:rPr>
             <w:rStyle w:val="Hyperlink"/>
+            <w:rFonts w:ascii="Arial" w:hAnsi="Arial" w:cs="Arial"/>
             <w:sz w:val="18"/>
             <w:szCs w:val="18"/>
           </w:rPr>
@@ -132,6 +157,7 @@
         <w:r>
           <w:rPr>
             <w:rStyle w:val="Hyperlink"/>
+            <w:rFonts w:ascii="Arial" w:hAnsi="Arial" w:cs="Arial"/>
             <w:sz w:val="18"/>
             <w:szCs w:val="18"/>
           </w:rPr>
@@ -141,6 +167,7 @@
         <w:r>
           <w:rPr>
             <w:rStyle w:val="Hyperlink"/>
+            <w:rFonts w:ascii="Arial" w:hAnsi="Arial" w:cs="Arial"/>
             <w:sz w:val="18"/>
             <w:szCs w:val="18"/>
           </w:rPr>
@@ -150,6 +177,7 @@
         <w:r>
           <w:rPr>
             <w:rStyle w:val="Hyperlink"/>
+            <w:rFonts w:ascii="Arial" w:hAnsi="Arial" w:cs="Arial"/>
             <w:sz w:val="18"/>
             <w:szCs w:val="18"/>
           </w:rPr>
@@ -159,6 +187,7 @@
         <w:r>
           <w:rPr>
             <w:rStyle w:val="Hyperlink"/>
+            <w:rFonts w:ascii="Arial" w:hAnsi="Arial" w:cs="Arial"/>
             <w:sz w:val="18"/>
             <w:szCs w:val="18"/>
           </w:rPr>
@@ -168,6 +197,7 @@
         <w:r>
           <w:rPr>
             <w:rStyle w:val="Hyperlink"/>
+            <w:rFonts w:ascii="Arial" w:hAnsi="Arial" w:cs="Arial"/>
             <w:sz w:val="18"/>
             <w:szCs w:val="18"/>
           </w:rPr>
@@ -181,9 +211,13 @@
           <w:bottom w:val="single" w:sz="12" w:space="1" w:color="555555"/>
         </w:pBdr>
         <w:spacing w:after="80"/>
-      </w:pPr>
-      <w:r>
-        <w:rPr>
+        <w:rPr>
+          <w:rFonts w:ascii="Arial" w:hAnsi="Arial" w:cs="Arial"/>
+        </w:rPr>
+      </w:pPr>
+      <w:r>
+        <w:rPr>
+          <w:rFonts w:ascii="Arial" w:hAnsi="Arial" w:cs="Arial"/>
           <w:sz w:val="4"/>
           <w:szCs w:val="4"/>
         </w:rPr>
@@ -193,9 +227,13 @@
     <w:p>
       <w:pPr>
         <w:spacing w:before="100" w:after="60"/>
-      </w:pPr>
-      <w:r>
-        <w:rPr>
+        <w:rPr>
+          <w:rFonts w:ascii="Arial" w:hAnsi="Arial" w:cs="Arial"/>
+        </w:rPr>
+      </w:pPr>
+      <w:r>
+        <w:rPr>
+          <w:rFonts w:ascii="Arial" w:hAnsi="Arial" w:cs="Arial"/>
           <w:b/>
           <w:bCs/>
           <w:sz w:val="22"/>
@@ -207,17 +245,27 @@
     <w:p>
       <w:pPr>
         <w:spacing w:after="60"/>
-      </w:pPr>
-      <w:r>
+        <w:rPr>
+          <w:rFonts w:ascii="Arial" w:hAnsi="Arial" w:cs="Arial"/>
+        </w:rPr>
+      </w:pPr>
+      <w:r>
+        <w:rPr>
+          <w:rFonts w:ascii="Arial" w:hAnsi="Arial" w:cs="Arial"/>
+        </w:rPr>
         <w:t>Technical Architect with 16 years of experience in technology architecture, software development, and system design. Led complex projects delivering solutions aligned with business goals. Strong problem-solving, strategic planning, and communication skills drive project success and operational efficiency. Focused on enhancing team collaboration and performance in fast-paced environments.</w:t>
       </w:r>
     </w:p>
     <w:p>
       <w:pPr>
         <w:spacing w:before="100" w:after="60"/>
-      </w:pPr>
-      <w:r>
-        <w:rPr>
+        <w:rPr>
+          <w:rFonts w:ascii="Arial" w:hAnsi="Arial" w:cs="Arial"/>
+        </w:rPr>
+      </w:pPr>
+      <w:r>
+        <w:rPr>
+          <w:rFonts w:ascii="Arial" w:hAnsi="Arial" w:cs="Arial"/>
           <w:b/>
           <w:bCs/>
           <w:sz w:val="22"/>
@@ -241,9 +289,13 @@
         </w:pBdr>
         <w:spacing w:after="0" w:line="240" w:lineRule="auto"/>
         <w:ind w:left="259" w:hanging="173"/>
-      </w:pPr>
-      <w:r>
-        <w:rPr>
+        <w:rPr>
+          <w:rFonts w:ascii="Arial" w:hAnsi="Arial" w:cs="Arial"/>
+        </w:rPr>
+      </w:pPr>
+      <w:r>
+        <w:rPr>
+          <w:rFonts w:ascii="Arial" w:hAnsi="Arial" w:cs="Arial"/>
           <w:color w:val="000000"/>
         </w:rPr>
         <w:t>Architected over 20 microservices and 50 REST APIs for distributed building-data platforms serving millions of users.</w:t>
@@ -264,9 +316,13 @@
         </w:pBdr>
         <w:spacing w:after="0" w:line="240" w:lineRule="auto"/>
         <w:ind w:left="259" w:hanging="173"/>
-      </w:pPr>
-      <w:r>
-        <w:rPr>
+        <w:rPr>
+          <w:rFonts w:ascii="Arial" w:hAnsi="Arial" w:cs="Arial"/>
+        </w:rPr>
+      </w:pPr>
+      <w:r>
+        <w:rPr>
+          <w:rFonts w:ascii="Arial" w:hAnsi="Arial" w:cs="Arial"/>
           <w:color w:val="000000"/>
         </w:rPr>
         <w:t>Enhanced application performance through architecture and database optimizations, achieving 25% faster response times.</w:t>
@@ -287,9 +343,13 @@
         </w:pBdr>
         <w:spacing w:after="20" w:line="240" w:lineRule="auto"/>
         <w:ind w:left="259" w:hanging="173"/>
-      </w:pPr>
-      <w:r>
-        <w:rPr>
+        <w:rPr>
+          <w:rFonts w:ascii="Arial" w:hAnsi="Arial" w:cs="Arial"/>
+        </w:rPr>
+      </w:pPr>
+      <w:r>
+        <w:rPr>
+          <w:rFonts w:ascii="Arial" w:hAnsi="Arial" w:cs="Arial"/>
           <w:color w:val="000000"/>
         </w:rPr>
         <w:t>Reduced infrastructure costs by implementing cloud optimization strategies, achieving 15% savings.</w:t>
@@ -298,9 +358,13 @@
     <w:p>
       <w:pPr>
         <w:spacing w:before="100" w:after="60"/>
-      </w:pPr>
-      <w:r>
-        <w:rPr>
+        <w:rPr>
+          <w:rFonts w:ascii="Arial" w:hAnsi="Arial" w:cs="Arial"/>
+        </w:rPr>
+      </w:pPr>
+      <w:r>
+        <w:rPr>
+          <w:rFonts w:ascii="Arial" w:hAnsi="Arial" w:cs="Arial"/>
           <w:b/>
           <w:bCs/>
           <w:sz w:val="22"/>
@@ -329,8 +393,14 @@
           <w:p>
             <w:pPr>
               <w:spacing w:after="20"/>
+              <w:rPr>
+                <w:rFonts w:ascii="Arial" w:hAnsi="Arial" w:cs="Arial"/>
+              </w:rPr>
             </w:pPr>
             <w:r>
+              <w:rPr>
+                <w:rFonts w:ascii="Arial" w:hAnsi="Arial" w:cs="Arial"/>
+              </w:rPr>
               <w:t>• Microservices architecture</w:t>
             </w:r>
           </w:p>
@@ -342,8 +412,14 @@
           <w:p>
             <w:pPr>
               <w:spacing w:after="20"/>
+              <w:rPr>
+                <w:rFonts w:ascii="Arial" w:hAnsi="Arial" w:cs="Arial"/>
+              </w:rPr>
             </w:pPr>
             <w:r>
+              <w:rPr>
+                <w:rFonts w:ascii="Arial" w:hAnsi="Arial" w:cs="Arial"/>
+              </w:rPr>
               <w:t>• Technical architecture</w:t>
             </w:r>
           </w:p>
@@ -357,8 +433,14 @@
           <w:p>
             <w:pPr>
               <w:spacing w:after="20"/>
+              <w:rPr>
+                <w:rFonts w:ascii="Arial" w:hAnsi="Arial" w:cs="Arial"/>
+              </w:rPr>
             </w:pPr>
             <w:r>
+              <w:rPr>
+                <w:rFonts w:ascii="Arial" w:hAnsi="Arial" w:cs="Arial"/>
+              </w:rPr>
               <w:t>• Cloud architecture</w:t>
             </w:r>
           </w:p>
@@ -370,8 +452,14 @@
           <w:p>
             <w:pPr>
               <w:spacing w:after="20"/>
+              <w:rPr>
+                <w:rFonts w:ascii="Arial" w:hAnsi="Arial" w:cs="Arial"/>
+              </w:rPr>
             </w:pPr>
             <w:r>
+              <w:rPr>
+                <w:rFonts w:ascii="Arial" w:hAnsi="Arial" w:cs="Arial"/>
+              </w:rPr>
               <w:t>• Microservices principles</w:t>
             </w:r>
           </w:p>
@@ -385,8 +473,14 @@
           <w:p>
             <w:pPr>
               <w:spacing w:after="20"/>
+              <w:rPr>
+                <w:rFonts w:ascii="Arial" w:hAnsi="Arial" w:cs="Arial"/>
+              </w:rPr>
             </w:pPr>
             <w:r>
+              <w:rPr>
+                <w:rFonts w:ascii="Arial" w:hAnsi="Arial" w:cs="Arial"/>
+              </w:rPr>
               <w:t>• API and integration design</w:t>
             </w:r>
           </w:p>
@@ -398,8 +492,14 @@
           <w:p>
             <w:pPr>
               <w:spacing w:after="20"/>
+              <w:rPr>
+                <w:rFonts w:ascii="Arial" w:hAnsi="Arial" w:cs="Arial"/>
+              </w:rPr>
             </w:pPr>
             <w:r>
+              <w:rPr>
+                <w:rFonts w:ascii="Arial" w:hAnsi="Arial" w:cs="Arial"/>
+              </w:rPr>
               <w:t>• Event-driven architecture</w:t>
             </w:r>
           </w:p>
@@ -413,8 +513,14 @@
           <w:p>
             <w:pPr>
               <w:spacing w:after="20"/>
+              <w:rPr>
+                <w:rFonts w:ascii="Arial" w:hAnsi="Arial" w:cs="Arial"/>
+              </w:rPr>
             </w:pPr>
             <w:r>
+              <w:rPr>
+                <w:rFonts w:ascii="Arial" w:hAnsi="Arial" w:cs="Arial"/>
+              </w:rPr>
               <w:t>• Domain-driven design</w:t>
             </w:r>
           </w:p>
@@ -426,8 +532,14 @@
           <w:p>
             <w:pPr>
               <w:spacing w:after="20"/>
+              <w:rPr>
+                <w:rFonts w:ascii="Arial" w:hAnsi="Arial" w:cs="Arial"/>
+              </w:rPr>
             </w:pPr>
             <w:r>
+              <w:rPr>
+                <w:rFonts w:ascii="Arial" w:hAnsi="Arial" w:cs="Arial"/>
+              </w:rPr>
               <w:t>• Performance optimization</w:t>
             </w:r>
           </w:p>
@@ -441,8 +553,14 @@
           <w:p>
             <w:pPr>
               <w:spacing w:after="20"/>
+              <w:rPr>
+                <w:rFonts w:ascii="Arial" w:hAnsi="Arial" w:cs="Arial"/>
+              </w:rPr>
             </w:pPr>
             <w:r>
+              <w:rPr>
+                <w:rFonts w:ascii="Arial" w:hAnsi="Arial" w:cs="Arial"/>
+              </w:rPr>
               <w:t>• CI/CD implementation</w:t>
             </w:r>
           </w:p>
@@ -454,8 +572,14 @@
           <w:p>
             <w:pPr>
               <w:spacing w:after="20"/>
+              <w:rPr>
+                <w:rFonts w:ascii="Arial" w:hAnsi="Arial" w:cs="Arial"/>
+              </w:rPr>
             </w:pPr>
             <w:r>
+              <w:rPr>
+                <w:rFonts w:ascii="Arial" w:hAnsi="Arial" w:cs="Arial"/>
+              </w:rPr>
               <w:t>• CI practices</w:t>
             </w:r>
           </w:p>
@@ -469,8 +593,14 @@
           <w:p>
             <w:pPr>
               <w:spacing w:after="20"/>
+              <w:rPr>
+                <w:rFonts w:ascii="Arial" w:hAnsi="Arial" w:cs="Arial"/>
+              </w:rPr>
             </w:pPr>
             <w:r>
+              <w:rPr>
+                <w:rFonts w:ascii="Arial" w:hAnsi="Arial" w:cs="Arial"/>
+              </w:rPr>
               <w:t>• Containerization and orchestration</w:t>
             </w:r>
           </w:p>
@@ -482,8 +612,14 @@
           <w:p>
             <w:pPr>
               <w:spacing w:after="20"/>
+              <w:rPr>
+                <w:rFonts w:ascii="Arial" w:hAnsi="Arial" w:cs="Arial"/>
+              </w:rPr>
             </w:pPr>
             <w:r>
+              <w:rPr>
+                <w:rFonts w:ascii="Arial" w:hAnsi="Arial" w:cs="Arial"/>
+              </w:rPr>
               <w:t>• REST API design</w:t>
             </w:r>
           </w:p>
@@ -497,8 +633,14 @@
           <w:p>
             <w:pPr>
               <w:spacing w:after="20"/>
+              <w:rPr>
+                <w:rFonts w:ascii="Arial" w:hAnsi="Arial" w:cs="Arial"/>
+              </w:rPr>
             </w:pPr>
             <w:r>
+              <w:rPr>
+                <w:rFonts w:ascii="Arial" w:hAnsi="Arial" w:cs="Arial"/>
+              </w:rPr>
               <w:t>• .NET Core / ASP.NET Core</w:t>
             </w:r>
           </w:p>
@@ -510,8 +652,14 @@
           <w:p>
             <w:pPr>
               <w:spacing w:after="20"/>
+              <w:rPr>
+                <w:rFonts w:ascii="Arial" w:hAnsi="Arial" w:cs="Arial"/>
+              </w:rPr>
             </w:pPr>
             <w:r>
+              <w:rPr>
+                <w:rFonts w:ascii="Arial" w:hAnsi="Arial" w:cs="Arial"/>
+              </w:rPr>
               <w:t>• C# programming</w:t>
             </w:r>
           </w:p>
@@ -525,8 +673,14 @@
           <w:p>
             <w:pPr>
               <w:spacing w:after="20"/>
+              <w:rPr>
+                <w:rFonts w:ascii="Arial" w:hAnsi="Arial" w:cs="Arial"/>
+              </w:rPr>
             </w:pPr>
             <w:r>
+              <w:rPr>
+                <w:rFonts w:ascii="Arial" w:hAnsi="Arial" w:cs="Arial"/>
+              </w:rPr>
               <w:t>• SQL Server management</w:t>
             </w:r>
           </w:p>
@@ -538,8 +692,14 @@
           <w:p>
             <w:pPr>
               <w:spacing w:after="20"/>
+              <w:rPr>
+                <w:rFonts w:ascii="Arial" w:hAnsi="Arial" w:cs="Arial"/>
+              </w:rPr>
             </w:pPr>
             <w:r>
+              <w:rPr>
+                <w:rFonts w:ascii="Arial" w:hAnsi="Arial" w:cs="Arial"/>
+              </w:rPr>
               <w:t>• PostgreSQL management</w:t>
             </w:r>
           </w:p>
@@ -553,8 +713,14 @@
           <w:p>
             <w:pPr>
               <w:spacing w:after="20"/>
+              <w:rPr>
+                <w:rFonts w:ascii="Arial" w:hAnsi="Arial" w:cs="Arial"/>
+              </w:rPr>
             </w:pPr>
             <w:r>
+              <w:rPr>
+                <w:rFonts w:ascii="Arial" w:hAnsi="Arial" w:cs="Arial"/>
+              </w:rPr>
               <w:t>• Database tuning techniques</w:t>
             </w:r>
           </w:p>
@@ -566,8 +732,14 @@
           <w:p>
             <w:pPr>
               <w:spacing w:after="20"/>
+              <w:rPr>
+                <w:rFonts w:ascii="Arial" w:hAnsi="Arial" w:cs="Arial"/>
+              </w:rPr>
             </w:pPr>
             <w:r>
+              <w:rPr>
+                <w:rFonts w:ascii="Arial" w:hAnsi="Arial" w:cs="Arial"/>
+              </w:rPr>
               <w:t>• Disaster recovery</w:t>
             </w:r>
           </w:p>
@@ -581,8 +753,14 @@
           <w:p>
             <w:pPr>
               <w:spacing w:after="20"/>
+              <w:rPr>
+                <w:rFonts w:ascii="Arial" w:hAnsi="Arial" w:cs="Arial"/>
+              </w:rPr>
             </w:pPr>
             <w:r>
+              <w:rPr>
+                <w:rFonts w:ascii="Arial" w:hAnsi="Arial" w:cs="Arial"/>
+              </w:rPr>
               <w:t>• Software development</w:t>
             </w:r>
           </w:p>
@@ -594,8 +772,14 @@
           <w:p>
             <w:pPr>
               <w:spacing w:after="20"/>
+              <w:rPr>
+                <w:rFonts w:ascii="Arial" w:hAnsi="Arial" w:cs="Arial"/>
+              </w:rPr>
             </w:pPr>
             <w:r>
+              <w:rPr>
+                <w:rFonts w:ascii="Arial" w:hAnsi="Arial" w:cs="Arial"/>
+              </w:rPr>
               <w:t>• Enterprise software development</w:t>
             </w:r>
           </w:p>
@@ -609,8 +793,14 @@
           <w:p>
             <w:pPr>
               <w:spacing w:after="20"/>
+              <w:rPr>
+                <w:rFonts w:ascii="Arial" w:hAnsi="Arial" w:cs="Arial"/>
+              </w:rPr>
             </w:pPr>
             <w:r>
+              <w:rPr>
+                <w:rFonts w:ascii="Arial" w:hAnsi="Arial" w:cs="Arial"/>
+              </w:rPr>
               <w:t>• Web applications</w:t>
             </w:r>
           </w:p>
@@ -622,8 +812,14 @@
           <w:p>
             <w:pPr>
               <w:spacing w:after="20"/>
+              <w:rPr>
+                <w:rFonts w:ascii="Arial" w:hAnsi="Arial" w:cs="Arial"/>
+              </w:rPr>
             </w:pPr>
             <w:r>
+              <w:rPr>
+                <w:rFonts w:ascii="Arial" w:hAnsi="Arial" w:cs="Arial"/>
+              </w:rPr>
               <w:t>• System design</w:t>
             </w:r>
           </w:p>
@@ -637,8 +833,14 @@
           <w:p>
             <w:pPr>
               <w:spacing w:after="20"/>
+              <w:rPr>
+                <w:rFonts w:ascii="Arial" w:hAnsi="Arial" w:cs="Arial"/>
+              </w:rPr>
             </w:pPr>
             <w:r>
+              <w:rPr>
+                <w:rFonts w:ascii="Arial" w:hAnsi="Arial" w:cs="Arial"/>
+              </w:rPr>
               <w:t>• Data modeling</w:t>
             </w:r>
           </w:p>
@@ -650,8 +852,14 @@
           <w:p>
             <w:pPr>
               <w:spacing w:after="20"/>
+              <w:rPr>
+                <w:rFonts w:ascii="Arial" w:hAnsi="Arial" w:cs="Arial"/>
+              </w:rPr>
             </w:pPr>
             <w:r>
+              <w:rPr>
+                <w:rFonts w:ascii="Arial" w:hAnsi="Arial" w:cs="Arial"/>
+              </w:rPr>
               <w:t>• Code review practices</w:t>
             </w:r>
           </w:p>
@@ -665,8 +873,14 @@
           <w:p>
             <w:pPr>
               <w:spacing w:after="20"/>
+              <w:rPr>
+                <w:rFonts w:ascii="Arial" w:hAnsi="Arial" w:cs="Arial"/>
+              </w:rPr>
             </w:pPr>
             <w:r>
+              <w:rPr>
+                <w:rFonts w:ascii="Arial" w:hAnsi="Arial" w:cs="Arial"/>
+              </w:rPr>
               <w:t>• Frontend architecture</w:t>
             </w:r>
           </w:p>
@@ -678,8 +892,14 @@
           <w:p>
             <w:pPr>
               <w:spacing w:after="20"/>
+              <w:rPr>
+                <w:rFonts w:ascii="Arial" w:hAnsi="Arial" w:cs="Arial"/>
+              </w:rPr>
             </w:pPr>
             <w:r>
+              <w:rPr>
+                <w:rFonts w:ascii="Arial" w:hAnsi="Arial" w:cs="Arial"/>
+              </w:rPr>
               <w:t>• Team leadership</w:t>
             </w:r>
           </w:p>
@@ -693,8 +913,14 @@
           <w:p>
             <w:pPr>
               <w:spacing w:after="20"/>
+              <w:rPr>
+                <w:rFonts w:ascii="Arial" w:hAnsi="Arial" w:cs="Arial"/>
+              </w:rPr>
             </w:pPr>
             <w:r>
+              <w:rPr>
+                <w:rFonts w:ascii="Arial" w:hAnsi="Arial" w:cs="Arial"/>
+              </w:rPr>
               <w:t>• Stakeholder engagement</w:t>
             </w:r>
           </w:p>
@@ -706,8 +932,14 @@
           <w:p>
             <w:pPr>
               <w:spacing w:after="20"/>
+              <w:rPr>
+                <w:rFonts w:ascii="Arial" w:hAnsi="Arial" w:cs="Arial"/>
+              </w:rPr>
             </w:pPr>
             <w:r>
+              <w:rPr>
+                <w:rFonts w:ascii="Arial" w:hAnsi="Arial" w:cs="Arial"/>
+              </w:rPr>
               <w:t>• Infrastructure automation</w:t>
             </w:r>
           </w:p>
@@ -721,8 +953,14 @@
           <w:p>
             <w:pPr>
               <w:spacing w:after="20"/>
+              <w:rPr>
+                <w:rFonts w:ascii="Arial" w:hAnsi="Arial" w:cs="Arial"/>
+              </w:rPr>
             </w:pPr>
             <w:r>
+              <w:rPr>
+                <w:rFonts w:ascii="Arial" w:hAnsi="Arial" w:cs="Arial"/>
+              </w:rPr>
               <w:t>• Enterprise architecture design</w:t>
             </w:r>
           </w:p>
@@ -734,8 +972,14 @@
           <w:p>
             <w:pPr>
               <w:spacing w:after="20"/>
+              <w:rPr>
+                <w:rFonts w:ascii="Arial" w:hAnsi="Arial" w:cs="Arial"/>
+              </w:rPr>
             </w:pPr>
             <w:r>
+              <w:rPr>
+                <w:rFonts w:ascii="Arial" w:hAnsi="Arial" w:cs="Arial"/>
+              </w:rPr>
               <w:t>• Client engagement</w:t>
             </w:r>
           </w:p>
@@ -749,8 +993,14 @@
           <w:p>
             <w:pPr>
               <w:spacing w:after="20"/>
+              <w:rPr>
+                <w:rFonts w:ascii="Arial" w:hAnsi="Arial" w:cs="Arial"/>
+              </w:rPr>
             </w:pPr>
             <w:r>
+              <w:rPr>
+                <w:rFonts w:ascii="Arial" w:hAnsi="Arial" w:cs="Arial"/>
+              </w:rPr>
               <w:t>• Communicating with clients</w:t>
             </w:r>
           </w:p>
@@ -759,16 +1009,26 @@
           <w:tcPr>
             <w:tcW w:w="5184" w:type="dxa"/>
           </w:tcPr>
-          <w:p/>
+          <w:p>
+            <w:pPr>
+              <w:rPr>
+                <w:rFonts w:ascii="Arial" w:hAnsi="Arial" w:cs="Arial"/>
+              </w:rPr>
+            </w:pPr>
+          </w:p>
         </w:tc>
       </w:tr>
     </w:tbl>
     <w:p>
       <w:pPr>
         <w:spacing w:before="100" w:after="60"/>
-      </w:pPr>
-      <w:r>
-        <w:rPr>
+        <w:rPr>
+          <w:rFonts w:ascii="Arial" w:hAnsi="Arial" w:cs="Arial"/>
+        </w:rPr>
+      </w:pPr>
+      <w:r>
+        <w:rPr>
+          <w:rFonts w:ascii="Arial" w:hAnsi="Arial" w:cs="Arial"/>
           <w:b/>
           <w:bCs/>
           <w:sz w:val="22"/>
@@ -780,9 +1040,13 @@
     <w:p>
       <w:pPr>
         <w:spacing w:before="60" w:after="0"/>
-      </w:pPr>
-      <w:r>
-        <w:rPr>
+        <w:rPr>
+          <w:rFonts w:ascii="Arial" w:hAnsi="Arial" w:cs="Arial"/>
+        </w:rPr>
+      </w:pPr>
+      <w:r>
+        <w:rPr>
+          <w:rFonts w:ascii="Arial" w:hAnsi="Arial" w:cs="Arial"/>
           <w:b/>
           <w:bCs/>
           <w:sz w:val="20"/>
@@ -794,9 +1058,13 @@
     <w:p>
       <w:pPr>
         <w:spacing w:after="20"/>
-      </w:pPr>
-      <w:r>
-        <w:rPr>
+        <w:rPr>
+          <w:rFonts w:ascii="Arial" w:hAnsi="Arial" w:cs="Arial"/>
+        </w:rPr>
+      </w:pPr>
+      <w:r>
+        <w:rPr>
+          <w:rFonts w:ascii="Arial" w:hAnsi="Arial" w:cs="Arial"/>
           <w:b/>
           <w:bCs/>
         </w:rPr>
@@ -818,9 +1086,13 @@
         </w:pBdr>
         <w:spacing w:after="0" w:line="240" w:lineRule="auto"/>
         <w:ind w:left="259" w:hanging="173"/>
-      </w:pPr>
-      <w:r>
-        <w:rPr>
+        <w:rPr>
+          <w:rFonts w:ascii="Arial" w:hAnsi="Arial" w:cs="Arial"/>
+        </w:rPr>
+      </w:pPr>
+      <w:r>
+        <w:rPr>
+          <w:rFonts w:ascii="Arial" w:hAnsi="Arial" w:cs="Arial"/>
           <w:color w:val="000000"/>
         </w:rPr>
         <w:t>Architected and optimized 20+ microservices and 50+ REST APIs supporting 1M+ users, delivering 25% improvement in application performance and 20% reduction in cloud/infrastructure costs.</w:t>
@@ -841,9 +1113,13 @@
         </w:pBdr>
         <w:spacing w:after="0" w:line="240" w:lineRule="auto"/>
         <w:ind w:left="259" w:hanging="173"/>
-      </w:pPr>
-      <w:r>
-        <w:rPr>
+        <w:rPr>
+          <w:rFonts w:ascii="Arial" w:hAnsi="Arial" w:cs="Arial"/>
+        </w:rPr>
+      </w:pPr>
+      <w:r>
+        <w:rPr>
+          <w:rFonts w:ascii="Arial" w:hAnsi="Arial" w:cs="Arial"/>
           <w:color w:val="000000"/>
         </w:rPr>
         <w:t>Led enterprise architecture initiatives across 4 teams/workstreams, improving system scalability by 30% and reducing technical/operational issues by 20%.</w:t>
@@ -864,9 +1140,13 @@
         </w:pBdr>
         <w:spacing w:after="20" w:line="240" w:lineRule="auto"/>
         <w:ind w:left="259" w:hanging="173"/>
-      </w:pPr>
-      <w:r>
-        <w:rPr>
+        <w:rPr>
+          <w:rFonts w:ascii="Arial" w:hAnsi="Arial" w:cs="Arial"/>
+        </w:rPr>
+      </w:pPr>
+      <w:r>
+        <w:rPr>
+          <w:rFonts w:ascii="Arial" w:hAnsi="Arial" w:cs="Arial"/>
           <w:color w:val="000000"/>
         </w:rPr>
         <w:t>Partnered with engineering and business stakeholders to deliver 15+ architectural improvements/features, accelerating delivery by 20%.</w:t>
@@ -875,9 +1155,13 @@
     <w:p>
       <w:pPr>
         <w:spacing w:before="60" w:after="0"/>
-      </w:pPr>
-      <w:r>
-        <w:rPr>
+        <w:rPr>
+          <w:rFonts w:ascii="Arial" w:hAnsi="Arial" w:cs="Arial"/>
+        </w:rPr>
+      </w:pPr>
+      <w:r>
+        <w:rPr>
+          <w:rFonts w:ascii="Arial" w:hAnsi="Arial" w:cs="Arial"/>
           <w:b/>
           <w:bCs/>
           <w:sz w:val="20"/>
@@ -889,9 +1173,13 @@
     <w:p>
       <w:pPr>
         <w:spacing w:after="20"/>
-      </w:pPr>
-      <w:r>
-        <w:rPr>
+        <w:rPr>
+          <w:rFonts w:ascii="Arial" w:hAnsi="Arial" w:cs="Arial"/>
+        </w:rPr>
+      </w:pPr>
+      <w:r>
+        <w:rPr>
+          <w:rFonts w:ascii="Arial" w:hAnsi="Arial" w:cs="Arial"/>
           <w:b/>
           <w:bCs/>
         </w:rPr>
@@ -913,9 +1201,13 @@
         </w:pBdr>
         <w:spacing w:after="0" w:line="240" w:lineRule="auto"/>
         <w:ind w:left="259" w:hanging="173"/>
-      </w:pPr>
-      <w:r>
-        <w:rPr>
+        <w:rPr>
+          <w:rFonts w:ascii="Arial" w:hAnsi="Arial" w:cs="Arial"/>
+        </w:rPr>
+      </w:pPr>
+      <w:r>
+        <w:rPr>
+          <w:rFonts w:ascii="Arial" w:hAnsi="Arial" w:cs="Arial"/>
           <w:color w:val="000000"/>
         </w:rPr>
         <w:t>Redesigned and optimized architecture for enterprise construction-software applications serving 1M+ users, improving application performance by 25% and scalability by 30%.</w:t>
@@ -936,9 +1228,13 @@
         </w:pBdr>
         <w:spacing w:after="0" w:line="240" w:lineRule="auto"/>
         <w:ind w:left="259" w:hanging="173"/>
-      </w:pPr>
-      <w:r>
-        <w:rPr>
+        <w:rPr>
+          <w:rFonts w:ascii="Arial" w:hAnsi="Arial" w:cs="Arial"/>
+        </w:rPr>
+      </w:pPr>
+      <w:r>
+        <w:rPr>
+          <w:rFonts w:ascii="Arial" w:hAnsi="Arial" w:cs="Arial"/>
           <w:color w:val="000000"/>
         </w:rPr>
         <w:t>Aligned 30+ technical requirements across cross-functional teams, accelerating delivery by 20% and improving business-to-engineering alignment.</w:t>
@@ -959,9 +1255,13 @@
         </w:pBdr>
         <w:spacing w:after="20" w:line="240" w:lineRule="auto"/>
         <w:ind w:left="259" w:hanging="173"/>
-      </w:pPr>
-      <w:r>
-        <w:rPr>
+        <w:rPr>
+          <w:rFonts w:ascii="Arial" w:hAnsi="Arial" w:cs="Arial"/>
+        </w:rPr>
+      </w:pPr>
+      <w:r>
+        <w:rPr>
+          <w:rFonts w:ascii="Arial" w:hAnsi="Arial" w:cs="Arial"/>
           <w:color w:val="000000"/>
         </w:rPr>
         <w:t>Identified and resolved 15+ architectural/performance bottlenecks, reducing system issues by 25% and improving reliability by 20%.</w:t>
@@ -971,6 +1271,7 @@
       <w:pPr>
         <w:spacing w:before="60" w:after="0"/>
         <w:rPr>
+          <w:rFonts w:ascii="Arial" w:hAnsi="Arial" w:cs="Arial"/>
           <w:b/>
           <w:bCs/>
           <w:sz w:val="20"/>
@@ -982,6 +1283,7 @@
       <w:pPr>
         <w:spacing w:before="60" w:after="0"/>
         <w:rPr>
+          <w:rFonts w:ascii="Arial" w:hAnsi="Arial" w:cs="Arial"/>
           <w:b/>
           <w:bCs/>
           <w:sz w:val="20"/>
@@ -992,24 +1294,31 @@
     <w:p>
       <w:pPr>
         <w:spacing w:before="60" w:after="0"/>
-      </w:pPr>
-      <w:r>
-        <w:rPr>
+        <w:rPr>
+          <w:rFonts w:ascii="Arial" w:hAnsi="Arial" w:cs="Arial"/>
+        </w:rPr>
+      </w:pPr>
+      <w:r>
+        <w:rPr>
+          <w:rFonts w:ascii="Arial" w:hAnsi="Arial" w:cs="Arial"/>
           <w:b/>
           <w:bCs/>
           <w:sz w:val="20"/>
           <w:szCs w:val="20"/>
         </w:rPr>
-        <w:lastRenderedPageBreak/>
         <w:t>Technical Lead, 05/2020 to 07/2023</w:t>
       </w:r>
     </w:p>
     <w:p>
       <w:pPr>
         <w:spacing w:after="20"/>
-      </w:pPr>
-      <w:r>
-        <w:rPr>
+        <w:rPr>
+          <w:rFonts w:ascii="Arial" w:hAnsi="Arial" w:cs="Arial"/>
+        </w:rPr>
+      </w:pPr>
+      <w:r>
+        <w:rPr>
+          <w:rFonts w:ascii="Arial" w:hAnsi="Arial" w:cs="Arial"/>
           <w:b/>
           <w:bCs/>
         </w:rPr>
@@ -1031,9 +1340,13 @@
         </w:pBdr>
         <w:spacing w:after="0" w:line="240" w:lineRule="auto"/>
         <w:ind w:left="259" w:hanging="173"/>
-      </w:pPr>
-      <w:r>
-        <w:rPr>
+        <w:rPr>
+          <w:rFonts w:ascii="Arial" w:hAnsi="Arial" w:cs="Arial"/>
+        </w:rPr>
+      </w:pPr>
+      <w:r>
+        <w:rPr>
+          <w:rFonts w:ascii="Arial" w:hAnsi="Arial" w:cs="Arial"/>
           <w:color w:val="000000"/>
         </w:rPr>
         <w:t>Architected 15+ scalable.NET Core and Scala backend services supporting 500K+ healthcare workflows/users, reducing response times by 30% and increasing processing capacity by 40%.</w:t>
@@ -1054,9 +1367,13 @@
         </w:pBdr>
         <w:spacing w:after="0" w:line="240" w:lineRule="auto"/>
         <w:ind w:left="259" w:hanging="173"/>
-      </w:pPr>
-      <w:r>
-        <w:rPr>
+        <w:rPr>
+          <w:rFonts w:ascii="Arial" w:hAnsi="Arial" w:cs="Arial"/>
+        </w:rPr>
+      </w:pPr>
+      <w:r>
+        <w:rPr>
+          <w:rFonts w:ascii="Arial" w:hAnsi="Arial" w:cs="Arial"/>
           <w:color w:val="000000"/>
         </w:rPr>
         <w:t>Led a team of 10 engineers to deliver a cloud-native healthcare platform, achieving 25% improvement in service availability and supporting 1M+ users/transactions.</w:t>
@@ -1077,9 +1394,13 @@
         </w:pBdr>
         <w:spacing w:after="0" w:line="240" w:lineRule="auto"/>
         <w:ind w:left="259" w:hanging="173"/>
-      </w:pPr>
-      <w:r>
-        <w:rPr>
+        <w:rPr>
+          <w:rFonts w:ascii="Arial" w:hAnsi="Arial" w:cs="Arial"/>
+        </w:rPr>
+      </w:pPr>
+      <w:r>
+        <w:rPr>
+          <w:rFonts w:ascii="Arial" w:hAnsi="Arial" w:cs="Arial"/>
           <w:color w:val="000000"/>
         </w:rPr>
         <w:t>Directed Docker and Kubernetes deployment strategy across 6 environments, reducing deployment time by 40% and deployment-related incidents by 30%.</w:t>
@@ -1100,9 +1421,13 @@
         </w:pBdr>
         <w:spacing w:after="20" w:line="240" w:lineRule="auto"/>
         <w:ind w:left="259" w:hanging="173"/>
-      </w:pPr>
-      <w:r>
-        <w:rPr>
+        <w:rPr>
+          <w:rFonts w:ascii="Arial" w:hAnsi="Arial" w:cs="Arial"/>
+        </w:rPr>
+      </w:pPr>
+      <w:r>
+        <w:rPr>
+          <w:rFonts w:ascii="Arial" w:hAnsi="Arial" w:cs="Arial"/>
           <w:color w:val="000000"/>
         </w:rPr>
         <w:t>Architected scalable backend services with.NET Core and Scala for enterprise healthcare workflows.</w:t>
@@ -1111,9 +1436,13 @@
     <w:p>
       <w:pPr>
         <w:spacing w:before="60" w:after="0"/>
-      </w:pPr>
-      <w:r>
-        <w:rPr>
+        <w:rPr>
+          <w:rFonts w:ascii="Arial" w:hAnsi="Arial" w:cs="Arial"/>
+        </w:rPr>
+      </w:pPr>
+      <w:r>
+        <w:rPr>
+          <w:rFonts w:ascii="Arial" w:hAnsi="Arial" w:cs="Arial"/>
           <w:b/>
           <w:bCs/>
           <w:sz w:val="20"/>
@@ -1125,9 +1454,13 @@
     <w:p>
       <w:pPr>
         <w:spacing w:after="20"/>
-      </w:pPr>
-      <w:r>
-        <w:rPr>
+        <w:rPr>
+          <w:rFonts w:ascii="Arial" w:hAnsi="Arial" w:cs="Arial"/>
+        </w:rPr>
+      </w:pPr>
+      <w:r>
+        <w:rPr>
+          <w:rFonts w:ascii="Arial" w:hAnsi="Arial" w:cs="Arial"/>
           <w:b/>
           <w:bCs/>
         </w:rPr>
@@ -1149,9 +1482,13 @@
         </w:pBdr>
         <w:spacing w:after="0" w:line="240" w:lineRule="auto"/>
         <w:ind w:left="259" w:hanging="173"/>
-      </w:pPr>
-      <w:r>
-        <w:rPr>
+        <w:rPr>
+          <w:rFonts w:ascii="Arial" w:hAnsi="Arial" w:cs="Arial"/>
+        </w:rPr>
+      </w:pPr>
+      <w:r>
+        <w:rPr>
+          <w:rFonts w:ascii="Arial" w:hAnsi="Arial" w:cs="Arial"/>
           <w:color w:val="000000"/>
         </w:rPr>
         <w:t>Led technical delivery across 3 concurrent healthcare software workstreams, delivering 20+ features/releases and improving delivery efficiency by 25%.</w:t>
@@ -1172,9 +1509,13 @@
         </w:pBdr>
         <w:spacing w:after="0" w:line="240" w:lineRule="auto"/>
         <w:ind w:left="259" w:hanging="173"/>
-      </w:pPr>
-      <w:r>
-        <w:rPr>
+        <w:rPr>
+          <w:rFonts w:ascii="Arial" w:hAnsi="Arial" w:cs="Arial"/>
+        </w:rPr>
+      </w:pPr>
+      <w:r>
+        <w:rPr>
+          <w:rFonts w:ascii="Arial" w:hAnsi="Arial" w:cs="Arial"/>
           <w:color w:val="000000"/>
         </w:rPr>
         <w:t>Coordinated requirements and timelines with 12+ stakeholders, achieving 95% on-time delivery across committed milestones.</w:t>
@@ -1195,9 +1536,13 @@
         </w:pBdr>
         <w:spacing w:after="0" w:line="240" w:lineRule="auto"/>
         <w:ind w:left="259" w:hanging="173"/>
-      </w:pPr>
-      <w:r>
-        <w:rPr>
+        <w:rPr>
+          <w:rFonts w:ascii="Arial" w:hAnsi="Arial" w:cs="Arial"/>
+        </w:rPr>
+      </w:pPr>
+      <w:r>
+        <w:rPr>
+          <w:rFonts w:ascii="Arial" w:hAnsi="Arial" w:cs="Arial"/>
           <w:color w:val="000000"/>
         </w:rPr>
         <w:t>Managed 8+ concurrent priorities under tight deadlines, improving delivery predictability by 20% while maintaining quality standards.</w:t>
@@ -1218,9 +1563,13 @@
         </w:pBdr>
         <w:spacing w:after="20" w:line="240" w:lineRule="auto"/>
         <w:ind w:left="259" w:hanging="173"/>
-      </w:pPr>
-      <w:r>
-        <w:rPr>
+        <w:rPr>
+          <w:rFonts w:ascii="Arial" w:hAnsi="Arial" w:cs="Arial"/>
+        </w:rPr>
+      </w:pPr>
+      <w:r>
+        <w:rPr>
+          <w:rFonts w:ascii="Arial" w:hAnsi="Arial" w:cs="Arial"/>
           <w:color w:val="000000"/>
         </w:rPr>
         <w:t>Resolved 30+ technical issues and production blockers, reducing project disruption by 30% and maintaining delivery momentum.</w:t>
@@ -1229,9 +1578,13 @@
     <w:p>
       <w:pPr>
         <w:spacing w:before="60" w:after="0"/>
-      </w:pPr>
-      <w:r>
-        <w:rPr>
+        <w:rPr>
+          <w:rFonts w:ascii="Arial" w:hAnsi="Arial" w:cs="Arial"/>
+        </w:rPr>
+      </w:pPr>
+      <w:r>
+        <w:rPr>
+          <w:rFonts w:ascii="Arial" w:hAnsi="Arial" w:cs="Arial"/>
           <w:b/>
           <w:bCs/>
           <w:sz w:val="20"/>
@@ -1243,9 +1596,13 @@
     <w:p>
       <w:pPr>
         <w:spacing w:after="20"/>
-      </w:pPr>
-      <w:r>
-        <w:rPr>
+        <w:rPr>
+          <w:rFonts w:ascii="Arial" w:hAnsi="Arial" w:cs="Arial"/>
+        </w:rPr>
+      </w:pPr>
+      <w:r>
+        <w:rPr>
+          <w:rFonts w:ascii="Arial" w:hAnsi="Arial" w:cs="Arial"/>
           <w:b/>
           <w:bCs/>
         </w:rPr>
@@ -1267,9 +1624,13 @@
         </w:pBdr>
         <w:spacing w:after="0" w:line="240" w:lineRule="auto"/>
         <w:ind w:left="259" w:hanging="173"/>
-      </w:pPr>
-      <w:r>
-        <w:rPr>
+        <w:rPr>
+          <w:rFonts w:ascii="Arial" w:hAnsi="Arial" w:cs="Arial"/>
+        </w:rPr>
+      </w:pPr>
+      <w:r>
+        <w:rPr>
+          <w:rFonts w:ascii="Arial" w:hAnsi="Arial" w:cs="Arial"/>
           <w:color w:val="000000"/>
         </w:rPr>
         <w:t>Developed and enhanced 25+ scalable application features/APIs, improving application performance by 25% and supporting 1M+ users/transactions.</w:t>
@@ -1290,9 +1651,13 @@
         </w:pBdr>
         <w:spacing w:after="0" w:line="240" w:lineRule="auto"/>
         <w:ind w:left="259" w:hanging="173"/>
-      </w:pPr>
-      <w:r>
-        <w:rPr>
+        <w:rPr>
+          <w:rFonts w:ascii="Arial" w:hAnsi="Arial" w:cs="Arial"/>
+        </w:rPr>
+      </w:pPr>
+      <w:r>
+        <w:rPr>
+          <w:rFonts w:ascii="Arial" w:hAnsi="Arial" w:cs="Arial"/>
           <w:color w:val="000000"/>
         </w:rPr>
         <w:t>Delivered 15+ application features that increased user engagement by 20% and improved feature adoption by 15%.</w:t>
@@ -1313,9 +1678,13 @@
         </w:pBdr>
         <w:spacing w:after="0" w:line="240" w:lineRule="auto"/>
         <w:ind w:left="259" w:hanging="173"/>
-      </w:pPr>
-      <w:r>
-        <w:rPr>
+        <w:rPr>
+          <w:rFonts w:ascii="Arial" w:hAnsi="Arial" w:cs="Arial"/>
+        </w:rPr>
+      </w:pPr>
+      <w:r>
+        <w:rPr>
+          <w:rFonts w:ascii="Arial" w:hAnsi="Arial" w:cs="Arial"/>
           <w:color w:val="000000"/>
         </w:rPr>
         <w:t>Performed 100+ code reviews and engineering-quality improvements, reducing production defects by 20% and improving code quality by 25%.</w:t>
@@ -1336,9 +1705,13 @@
         </w:pBdr>
         <w:spacing w:after="20" w:line="240" w:lineRule="auto"/>
         <w:ind w:left="259" w:hanging="173"/>
-      </w:pPr>
-      <w:r>
-        <w:rPr>
+        <w:rPr>
+          <w:rFonts w:ascii="Arial" w:hAnsi="Arial" w:cs="Arial"/>
+        </w:rPr>
+      </w:pPr>
+      <w:r>
+        <w:rPr>
+          <w:rFonts w:ascii="Arial" w:hAnsi="Arial" w:cs="Arial"/>
           <w:color w:val="000000"/>
         </w:rPr>
         <w:t>Identified and implemented 10+ architecture optimizations, reducing system latency by 25% and improving overall reliability by 20%.</w:t>
@@ -1347,9 +1720,13 @@
     <w:p>
       <w:pPr>
         <w:spacing w:before="60" w:after="0"/>
-      </w:pPr>
-      <w:r>
-        <w:rPr>
+        <w:rPr>
+          <w:rFonts w:ascii="Arial" w:hAnsi="Arial" w:cs="Arial"/>
+        </w:rPr>
+      </w:pPr>
+      <w:r>
+        <w:rPr>
+          <w:rFonts w:ascii="Arial" w:hAnsi="Arial" w:cs="Arial"/>
           <w:b/>
           <w:bCs/>
           <w:sz w:val="20"/>
@@ -1361,9 +1738,13 @@
     <w:p>
       <w:pPr>
         <w:spacing w:after="20"/>
-      </w:pPr>
-      <w:r>
-        <w:rPr>
+        <w:rPr>
+          <w:rFonts w:ascii="Arial" w:hAnsi="Arial" w:cs="Arial"/>
+        </w:rPr>
+      </w:pPr>
+      <w:r>
+        <w:rPr>
+          <w:rFonts w:ascii="Arial" w:hAnsi="Arial" w:cs="Arial"/>
           <w:b/>
           <w:bCs/>
         </w:rPr>
@@ -1385,9 +1766,13 @@
         </w:pBdr>
         <w:spacing w:after="0" w:line="240" w:lineRule="auto"/>
         <w:ind w:left="259" w:hanging="173"/>
-      </w:pPr>
-      <w:r>
-        <w:rPr>
+        <w:rPr>
+          <w:rFonts w:ascii="Arial" w:hAnsi="Arial" w:cs="Arial"/>
+        </w:rPr>
+      </w:pPr>
+      <w:r>
+        <w:rPr>
+          <w:rFonts w:ascii="Arial" w:hAnsi="Arial" w:cs="Arial"/>
           <w:color w:val="000000"/>
         </w:rPr>
         <w:t>Architected and scaled APIs and messaging systems processing 1M+ transactions/messages per day, improving system reliability by 20% and reducing latency by 30%.</w:t>
@@ -1408,9 +1793,13 @@
         </w:pBdr>
         <w:spacing w:after="0" w:line="240" w:lineRule="auto"/>
         <w:ind w:left="259" w:hanging="173"/>
-      </w:pPr>
-      <w:r>
-        <w:rPr>
+        <w:rPr>
+          <w:rFonts w:ascii="Arial" w:hAnsi="Arial" w:cs="Arial"/>
+        </w:rPr>
+      </w:pPr>
+      <w:r>
+        <w:rPr>
+          <w:rFonts w:ascii="Arial" w:hAnsi="Arial" w:cs="Arial"/>
           <w:color w:val="000000"/>
         </w:rPr>
         <w:t>Led delivery across 20+ enterprise integrations/services, increasing backend processing capacity by 40% while supporting high-volume retail workloads.</w:t>
@@ -1431,9 +1820,13 @@
         </w:pBdr>
         <w:spacing w:after="20" w:line="240" w:lineRule="auto"/>
         <w:ind w:left="259" w:hanging="173"/>
-      </w:pPr>
-      <w:r>
-        <w:rPr>
+        <w:rPr>
+          <w:rFonts w:ascii="Arial" w:hAnsi="Arial" w:cs="Arial"/>
+        </w:rPr>
+      </w:pPr>
+      <w:r>
+        <w:rPr>
+          <w:rFonts w:ascii="Arial" w:hAnsi="Arial" w:cs="Arial"/>
           <w:color w:val="000000"/>
         </w:rPr>
         <w:t>Mentored 8+ junior and mid-level engineers through code reviews and technical guidance, reducing recurring defects by 20% and improving engineering standards.</w:t>
@@ -1442,9 +1835,13 @@
     <w:p>
       <w:pPr>
         <w:spacing w:before="60" w:after="0"/>
-      </w:pPr>
-      <w:r>
-        <w:rPr>
+        <w:rPr>
+          <w:rFonts w:ascii="Arial" w:hAnsi="Arial" w:cs="Arial"/>
+        </w:rPr>
+      </w:pPr>
+      <w:r>
+        <w:rPr>
+          <w:rFonts w:ascii="Arial" w:hAnsi="Arial" w:cs="Arial"/>
           <w:b/>
           <w:bCs/>
           <w:sz w:val="20"/>
@@ -1456,9 +1853,13 @@
     <w:p>
       <w:pPr>
         <w:spacing w:after="20"/>
-      </w:pPr>
-      <w:r>
-        <w:rPr>
+        <w:rPr>
+          <w:rFonts w:ascii="Arial" w:hAnsi="Arial" w:cs="Arial"/>
+        </w:rPr>
+      </w:pPr>
+      <w:r>
+        <w:rPr>
+          <w:rFonts w:ascii="Arial" w:hAnsi="Arial" w:cs="Arial"/>
           <w:b/>
           <w:bCs/>
         </w:rPr>
@@ -1480,9 +1881,13 @@
         </w:pBdr>
         <w:spacing w:after="0" w:line="240" w:lineRule="auto"/>
         <w:ind w:left="259" w:hanging="173"/>
-      </w:pPr>
-      <w:r>
-        <w:rPr>
+        <w:rPr>
+          <w:rFonts w:ascii="Arial" w:hAnsi="Arial" w:cs="Arial"/>
+        </w:rPr>
+      </w:pPr>
+      <w:r>
+        <w:rPr>
+          <w:rFonts w:ascii="Arial" w:hAnsi="Arial" w:cs="Arial"/>
           <w:color w:val="000000"/>
         </w:rPr>
         <w:t>Optimized database and backend services supporting 1M+ users/transactions, reducing average query/API response time by 30% and improving application responsiveness by 25%.</w:t>
@@ -1503,9 +1908,13 @@
         </w:pBdr>
         <w:spacing w:after="0" w:line="240" w:lineRule="auto"/>
         <w:ind w:left="259" w:hanging="173"/>
-      </w:pPr>
-      <w:r>
-        <w:rPr>
+        <w:rPr>
+          <w:rFonts w:ascii="Arial" w:hAnsi="Arial" w:cs="Arial"/>
+        </w:rPr>
+      </w:pPr>
+      <w:r>
+        <w:rPr>
+          <w:rFonts w:ascii="Arial" w:hAnsi="Arial" w:cs="Arial"/>
           <w:color w:val="000000"/>
         </w:rPr>
         <w:t>Reduced production issues by 25% through improved error handling, diagnostics, and backend reliability practices.</w:t>
@@ -1526,9 +1935,13 @@
         </w:pBdr>
         <w:spacing w:after="20" w:line="240" w:lineRule="auto"/>
         <w:ind w:left="259" w:hanging="173"/>
-      </w:pPr>
-      <w:r>
-        <w:rPr>
+        <w:rPr>
+          <w:rFonts w:ascii="Arial" w:hAnsi="Arial" w:cs="Arial"/>
+        </w:rPr>
+      </w:pPr>
+      <w:r>
+        <w:rPr>
+          <w:rFonts w:ascii="Arial" w:hAnsi="Arial" w:cs="Arial"/>
           <w:color w:val="000000"/>
         </w:rPr>
         <w:t>Delivered 20+ backend enhancements and performance improvements, reducing operational/manual effort by 40+ hours per month.</w:t>
@@ -1537,9 +1950,13 @@
     <w:p>
       <w:pPr>
         <w:spacing w:before="60" w:after="0"/>
-      </w:pPr>
-      <w:r>
-        <w:rPr>
+        <w:rPr>
+          <w:rFonts w:ascii="Arial" w:hAnsi="Arial" w:cs="Arial"/>
+        </w:rPr>
+      </w:pPr>
+      <w:r>
+        <w:rPr>
+          <w:rFonts w:ascii="Arial" w:hAnsi="Arial" w:cs="Arial"/>
           <w:b/>
           <w:bCs/>
           <w:sz w:val="20"/>
@@ -1551,9 +1968,13 @@
     <w:p>
       <w:pPr>
         <w:spacing w:after="20"/>
-      </w:pPr>
-      <w:r>
-        <w:rPr>
+        <w:rPr>
+          <w:rFonts w:ascii="Arial" w:hAnsi="Arial" w:cs="Arial"/>
+        </w:rPr>
+      </w:pPr>
+      <w:r>
+        <w:rPr>
+          <w:rFonts w:ascii="Arial" w:hAnsi="Arial" w:cs="Arial"/>
           <w:b/>
           <w:bCs/>
         </w:rPr>
@@ -1575,9 +1996,13 @@
         </w:pBdr>
         <w:spacing w:after="0" w:line="240" w:lineRule="auto"/>
         <w:ind w:left="259" w:hanging="173"/>
-      </w:pPr>
-      <w:r>
-        <w:rPr>
+        <w:rPr>
+          <w:rFonts w:ascii="Arial" w:hAnsi="Arial" w:cs="Arial"/>
+        </w:rPr>
+      </w:pPr>
+      <w:r>
+        <w:rPr>
+          <w:rFonts w:ascii="Arial" w:hAnsi="Arial" w:cs="Arial"/>
           <w:color w:val="000000"/>
         </w:rPr>
         <w:t>Engineered workforce-management solutions using ASP.NET and SQL Server for 20+ enterprise clients and 100K+ users, improving system performance by 20% and supporting 50+ business workflows.</w:t>
@@ -1598,9 +2023,13 @@
         </w:pBdr>
         <w:spacing w:after="0" w:line="240" w:lineRule="auto"/>
         <w:ind w:left="259" w:hanging="173"/>
-      </w:pPr>
-      <w:r>
-        <w:rPr>
+        <w:rPr>
+          <w:rFonts w:ascii="Arial" w:hAnsi="Arial" w:cs="Arial"/>
+        </w:rPr>
+      </w:pPr>
+      <w:r>
+        <w:rPr>
+          <w:rFonts w:ascii="Arial" w:hAnsi="Arial" w:cs="Arial"/>
           <w:color w:val="000000"/>
         </w:rPr>
         <w:t>Developed 15+ scheduling/workforce modules that reduced manual effort by 40+ hours per month and improved scheduling efficiency by 30%.</w:t>
@@ -1621,9 +2050,13 @@
         </w:pBdr>
         <w:spacing w:after="20" w:line="240" w:lineRule="auto"/>
         <w:ind w:left="259" w:hanging="173"/>
-      </w:pPr>
-      <w:r>
-        <w:rPr>
+        <w:rPr>
+          <w:rFonts w:ascii="Arial" w:hAnsi="Arial" w:cs="Arial"/>
+        </w:rPr>
+      </w:pPr>
+      <w:r>
+        <w:rPr>
+          <w:rFonts w:ascii="Arial" w:hAnsi="Arial" w:cs="Arial"/>
           <w:color w:val="000000"/>
         </w:rPr>
         <w:t>Collaborated with 15+ business and technical stakeholders to deliver 30+ enhancements, improving delivery efficiency by 25% and supporting successful project outcomes.</w:t>
@@ -1632,56 +2065,145 @@
     <w:p>
       <w:pPr>
         <w:spacing w:before="100" w:after="60"/>
-      </w:pPr>
-      <w:r>
-        <w:rPr>
+        <w:rPr>
+          <w:rFonts w:ascii="Arial" w:hAnsi="Arial" w:cs="Arial"/>
+        </w:rPr>
+      </w:pPr>
+      <w:r>
+        <w:rPr>
+          <w:rFonts w:ascii="Arial" w:hAnsi="Arial" w:cs="Arial"/>
           <w:b/>
           <w:bCs/>
           <w:sz w:val="22"/>
           <w:szCs w:val="22"/>
         </w:rPr>
-        <w:t>EDUCATION</w:t>
-      </w:r>
-    </w:p>
-    <w:p>
-      <w:pPr>
-        <w:spacing w:after="20"/>
-      </w:pPr>
-      <w:proofErr w:type="spellStart"/>
-      <w:proofErr w:type="gramStart"/>
-      <w:r>
-        <w:rPr>
-          <w:b/>
-          <w:bCs/>
-        </w:rPr>
-        <w:t>B.Tech</w:t>
-      </w:r>
-      <w:proofErr w:type="spellEnd"/>
-      <w:proofErr w:type="gramEnd"/>
-      <w:r>
-        <w:rPr>
-          <w:b/>
-          <w:bCs/>
-        </w:rPr>
-        <w:t>: Information Technology, 01/2010</w:t>
-      </w:r>
-    </w:p>
-    <w:p>
-      <w:pPr>
-        <w:spacing w:after="60"/>
-      </w:pPr>
-      <w:r>
-        <w:rPr>
-          <w:b/>
-          <w:bCs/>
-        </w:rPr>
-        <w:t>V.R. Siddhartha Engineering College - Vijayawada</w:t>
+        <w:t>CERTIFICATIONS</w:t>
+      </w:r>
+    </w:p>
+    <w:p>
+      <w:pPr>
+        <w:numPr>
+          <w:ilvl w:val="0"/>
+          <w:numId w:val="1"/>
+        </w:numPr>
+        <w:pBdr>
+          <w:top w:val="nil"/>
+          <w:left w:val="nil"/>
+          <w:bottom w:val="nil"/>
+          <w:right w:val="nil"/>
+          <w:between w:val="nil"/>
+        </w:pBdr>
+        <w:spacing w:after="0" w:line="240" w:lineRule="auto"/>
+        <w:ind w:left="259" w:hanging="173"/>
+        <w:rPr>
+          <w:rFonts w:ascii="Arial" w:hAnsi="Arial" w:cs="Arial"/>
+          <w:color w:val="000000"/>
+        </w:rPr>
+      </w:pPr>
+      <w:r>
+        <w:rPr>
+          <w:rFonts w:ascii="Arial" w:hAnsi="Arial" w:cs="Arial"/>
+          <w:color w:val="000000"/>
+        </w:rPr>
+        <w:t xml:space="preserve">AWS Certified Solutions Architect – Associate | </w:t>
+      </w:r>
+      <w:r>
+        <w:rPr>
+          <w:rFonts w:ascii="Arial" w:hAnsi="Arial" w:cs="Arial"/>
+          <w:color w:val="000000"/>
+        </w:rPr>
+        <w:t>2024</w:t>
+      </w:r>
+    </w:p>
+    <w:p>
+      <w:pPr>
+        <w:numPr>
+          <w:ilvl w:val="0"/>
+          <w:numId w:val="1"/>
+        </w:numPr>
+        <w:pBdr>
+          <w:top w:val="nil"/>
+          <w:left w:val="nil"/>
+          <w:bottom w:val="nil"/>
+          <w:right w:val="nil"/>
+          <w:between w:val="nil"/>
+        </w:pBdr>
+        <w:spacing w:after="0" w:line="240" w:lineRule="auto"/>
+        <w:ind w:left="259" w:hanging="173"/>
+        <w:rPr>
+          <w:rFonts w:ascii="Arial" w:hAnsi="Arial" w:cs="Arial"/>
+          <w:color w:val="000000"/>
+        </w:rPr>
+      </w:pPr>
+      <w:r>
+        <w:rPr>
+          <w:rFonts w:ascii="Arial" w:hAnsi="Arial" w:cs="Arial"/>
+          <w:color w:val="000000"/>
+        </w:rPr>
+        <w:t xml:space="preserve">Coursera: Application Development using Microservices and Serverless | </w:t>
+      </w:r>
+      <w:r>
+        <w:rPr>
+          <w:rFonts w:ascii="Arial" w:hAnsi="Arial" w:cs="Arial"/>
+          <w:color w:val="000000"/>
+        </w:rPr>
+        <w:t>2020</w:t>
+      </w:r>
+    </w:p>
+    <w:p>
+      <w:pPr>
+        <w:numPr>
+          <w:ilvl w:val="0"/>
+          <w:numId w:val="1"/>
+        </w:numPr>
+        <w:pBdr>
+          <w:top w:val="nil"/>
+          <w:left w:val="nil"/>
+          <w:bottom w:val="nil"/>
+          <w:right w:val="nil"/>
+          <w:between w:val="nil"/>
+        </w:pBdr>
+        <w:spacing w:after="0" w:line="240" w:lineRule="auto"/>
+        <w:ind w:left="259" w:hanging="173"/>
+        <w:rPr>
+          <w:rFonts w:ascii="Arial" w:hAnsi="Arial" w:cs="Arial"/>
+          <w:color w:val="000000"/>
+        </w:rPr>
+      </w:pPr>
+      <w:r>
+        <w:rPr>
+          <w:rFonts w:ascii="Arial" w:hAnsi="Arial" w:cs="Arial"/>
+          <w:color w:val="000000"/>
+        </w:rPr>
+        <w:t xml:space="preserve">Microsoft Certified: </w:t>
+      </w:r>
+      <w:r>
+        <w:rPr>
+          <w:rFonts w:ascii="Arial" w:hAnsi="Arial" w:cs="Arial"/>
+          <w:color w:val="000000"/>
+        </w:rPr>
+        <w:t xml:space="preserve">.NET </w:t>
+      </w:r>
+      <w:r>
+        <w:rPr>
+          <w:rFonts w:ascii="Arial" w:hAnsi="Arial" w:cs="Arial"/>
+          <w:color w:val="000000"/>
+        </w:rPr>
+        <w:t xml:space="preserve">Developer Associate | </w:t>
+      </w:r>
+      <w:r>
+        <w:rPr>
+          <w:rFonts w:ascii="Arial" w:hAnsi="Arial" w:cs="Arial"/>
+          <w:color w:val="000000"/>
+        </w:rPr>
+        <w:t>2016</w:t>
       </w:r>
     </w:p>
     <w:p>
       <w:pPr>
         <w:spacing w:before="100" w:after="60"/>
         <w:rPr>
+          <w:rFonts w:ascii="Arial" w:hAnsi="Arial" w:cs="Arial"/>
           <w:b/>
           <w:bCs/>
           <w:sz w:val="22"/>
@@ -1693,36 +2215,80 @@
       <w:pPr>
         <w:spacing w:before="100" w:after="60"/>
         <w:rPr>
+          <w:rFonts w:ascii="Arial" w:hAnsi="Arial" w:cs="Arial"/>
+        </w:rPr>
+      </w:pPr>
+      <w:r>
+        <w:rPr>
+          <w:rFonts w:ascii="Arial" w:hAnsi="Arial" w:cs="Arial"/>
           <w:b/>
           <w:bCs/>
           <w:sz w:val="22"/>
           <w:szCs w:val="22"/>
         </w:rPr>
-      </w:pPr>
+        <w:lastRenderedPageBreak/>
+        <w:t>EDUCATION</w:t>
+      </w:r>
+    </w:p>
+    <w:p>
+      <w:pPr>
+        <w:spacing w:after="20"/>
+        <w:rPr>
+          <w:rFonts w:ascii="Arial" w:hAnsi="Arial" w:cs="Arial"/>
+        </w:rPr>
+      </w:pPr>
+      <w:proofErr w:type="spellStart"/>
+      <w:proofErr w:type="gramStart"/>
+      <w:r>
+        <w:rPr>
+          <w:rFonts w:ascii="Arial" w:hAnsi="Arial" w:cs="Arial"/>
+          <w:b/>
+          <w:bCs/>
+        </w:rPr>
+        <w:t>B.Tech</w:t>
+      </w:r>
+      <w:proofErr w:type="spellEnd"/>
+      <w:proofErr w:type="gramEnd"/>
+      <w:r>
+        <w:rPr>
+          <w:rFonts w:ascii="Arial" w:hAnsi="Arial" w:cs="Arial"/>
+          <w:b/>
+          <w:bCs/>
+        </w:rPr>
+        <w:t>: Information Technology, 01/2010</w:t>
+      </w:r>
+    </w:p>
+    <w:p>
+      <w:pPr>
+        <w:spacing w:after="60"/>
+        <w:rPr>
+          <w:rFonts w:ascii="Arial" w:hAnsi="Arial" w:cs="Arial"/>
+        </w:rPr>
+      </w:pPr>
+      <w:r>
+        <w:rPr>
+          <w:rFonts w:ascii="Arial" w:hAnsi="Arial" w:cs="Arial"/>
+          <w:b/>
+          <w:bCs/>
+        </w:rPr>
+        <w:t>V.R. Siddhartha Engineering College - Vijayawada</w:t>
+      </w:r>
     </w:p>
     <w:p>
       <w:pPr>
         <w:spacing w:before="100" w:after="60"/>
         <w:rPr>
+          <w:rFonts w:ascii="Arial" w:hAnsi="Arial" w:cs="Arial"/>
+        </w:rPr>
+      </w:pPr>
+      <w:r>
+        <w:rPr>
+          <w:rFonts w:ascii="Arial" w:hAnsi="Arial" w:cs="Arial"/>
           <w:b/>
           <w:bCs/>
           <w:sz w:val="22"/>
           <w:szCs w:val="22"/>
         </w:rPr>
-      </w:pPr>
-    </w:p>
-    <w:p>
-      <w:pPr>
-        <w:spacing w:before="100" w:after="60"/>
-      </w:pPr>
-      <w:r>
-        <w:rPr>
-          <w:b/>
-          <w:bCs/>
-          <w:sz w:val="22"/>
-          <w:szCs w:val="22"/>
-        </w:rPr>
-        <w:lastRenderedPageBreak/>
         <w:t>CORE TECHNICAL COMPETENCIES</w:t>
       </w:r>
     </w:p>
@@ -1741,9 +2307,13 @@
         </w:pBdr>
         <w:spacing w:after="0" w:line="240" w:lineRule="auto"/>
         <w:ind w:left="259" w:hanging="173"/>
-      </w:pPr>
-      <w:r>
-        <w:rPr>
+        <w:rPr>
+          <w:rFonts w:ascii="Arial" w:hAnsi="Arial" w:cs="Arial"/>
+        </w:rPr>
+      </w:pPr>
+      <w:r>
+        <w:rPr>
+          <w:rFonts w:ascii="Arial" w:hAnsi="Arial" w:cs="Arial"/>
           <w:color w:val="000000"/>
         </w:rPr>
         <w:t>System &amp; Distributed Systems Design</w:t>
@@ -1764,9 +2334,13 @@
         </w:pBdr>
         <w:spacing w:after="0" w:line="240" w:lineRule="auto"/>
         <w:ind w:left="259" w:hanging="173"/>
-      </w:pPr>
-      <w:r>
-        <w:rPr>
+        <w:rPr>
+          <w:rFonts w:ascii="Arial" w:hAnsi="Arial" w:cs="Arial"/>
+        </w:rPr>
+      </w:pPr>
+      <w:r>
+        <w:rPr>
+          <w:rFonts w:ascii="Arial" w:hAnsi="Arial" w:cs="Arial"/>
           <w:color w:val="000000"/>
         </w:rPr>
         <w:t>Microservices Architecture</w:t>
@@ -1787,9 +2361,13 @@
         </w:pBdr>
         <w:spacing w:after="0" w:line="240" w:lineRule="auto"/>
         <w:ind w:left="259" w:hanging="173"/>
-      </w:pPr>
-      <w:r>
-        <w:rPr>
+        <w:rPr>
+          <w:rFonts w:ascii="Arial" w:hAnsi="Arial" w:cs="Arial"/>
+        </w:rPr>
+      </w:pPr>
+      <w:r>
+        <w:rPr>
+          <w:rFonts w:ascii="Arial" w:hAnsi="Arial" w:cs="Arial"/>
           <w:color w:val="000000"/>
         </w:rPr>
         <w:t>API &amp; Integration Design</w:t>
@@ -1810,9 +2388,13 @@
         </w:pBdr>
         <w:spacing w:after="0" w:line="240" w:lineRule="auto"/>
         <w:ind w:left="259" w:hanging="173"/>
-      </w:pPr>
-      <w:r>
-        <w:rPr>
+        <w:rPr>
+          <w:rFonts w:ascii="Arial" w:hAnsi="Arial" w:cs="Arial"/>
+        </w:rPr>
+      </w:pPr>
+      <w:r>
+        <w:rPr>
+          <w:rFonts w:ascii="Arial" w:hAnsi="Arial" w:cs="Arial"/>
           <w:color w:val="000000"/>
         </w:rPr>
         <w:t>Event-Driven Architecture (Kafka, RabbitMQ)</w:t>
@@ -1833,9 +2415,13 @@
         </w:pBdr>
         <w:spacing w:after="0" w:line="240" w:lineRule="auto"/>
         <w:ind w:left="259" w:hanging="173"/>
-      </w:pPr>
-      <w:r>
-        <w:rPr>
+        <w:rPr>
+          <w:rFonts w:ascii="Arial" w:hAnsi="Arial" w:cs="Arial"/>
+        </w:rPr>
+      </w:pPr>
+      <w:r>
+        <w:rPr>
+          <w:rFonts w:ascii="Arial" w:hAnsi="Arial" w:cs="Arial"/>
           <w:color w:val="000000"/>
         </w:rPr>
         <w:t>Domain-Driven Design</w:t>
@@ -1856,9 +2442,13 @@
         </w:pBdr>
         <w:spacing w:after="0" w:line="240" w:lineRule="auto"/>
         <w:ind w:left="259" w:hanging="173"/>
-      </w:pPr>
-      <w:r>
-        <w:rPr>
+        <w:rPr>
+          <w:rFonts w:ascii="Arial" w:hAnsi="Arial" w:cs="Arial"/>
+        </w:rPr>
+      </w:pPr>
+      <w:r>
+        <w:rPr>
+          <w:rFonts w:ascii="Arial" w:hAnsi="Arial" w:cs="Arial"/>
           <w:color w:val="000000"/>
         </w:rPr>
         <w:t>Design Patterns</w:t>
@@ -1879,9 +2469,13 @@
         </w:pBdr>
         <w:spacing w:after="0" w:line="240" w:lineRule="auto"/>
         <w:ind w:left="259" w:hanging="173"/>
-      </w:pPr>
-      <w:r>
-        <w:rPr>
+        <w:rPr>
+          <w:rFonts w:ascii="Arial" w:hAnsi="Arial" w:cs="Arial"/>
+        </w:rPr>
+      </w:pPr>
+      <w:r>
+        <w:rPr>
+          <w:rFonts w:ascii="Arial" w:hAnsi="Arial" w:cs="Arial"/>
           <w:color w:val="000000"/>
         </w:rPr>
         <w:t>Non-Functional Requirements (Scalability, Reliability, Performance)</w:t>
@@ -1902,9 +2496,13 @@
         </w:pBdr>
         <w:spacing w:after="0" w:line="240" w:lineRule="auto"/>
         <w:ind w:left="259" w:hanging="173"/>
-      </w:pPr>
-      <w:r>
-        <w:rPr>
+        <w:rPr>
+          <w:rFonts w:ascii="Arial" w:hAnsi="Arial" w:cs="Arial"/>
+        </w:rPr>
+      </w:pPr>
+      <w:r>
+        <w:rPr>
+          <w:rFonts w:ascii="Arial" w:hAnsi="Arial" w:cs="Arial"/>
           <w:color w:val="000000"/>
         </w:rPr>
         <w:t>Cloud Architecture (AWS, Azure)</w:t>
@@ -1925,9 +2523,13 @@
         </w:pBdr>
         <w:spacing w:after="0" w:line="240" w:lineRule="auto"/>
         <w:ind w:left="259" w:hanging="173"/>
-      </w:pPr>
-      <w:r>
-        <w:rPr>
+        <w:rPr>
+          <w:rFonts w:ascii="Arial" w:hAnsi="Arial" w:cs="Arial"/>
+        </w:rPr>
+      </w:pPr>
+      <w:r>
+        <w:rPr>
+          <w:rFonts w:ascii="Arial" w:hAnsi="Arial" w:cs="Arial"/>
           <w:color w:val="000000"/>
         </w:rPr>
         <w:t>Containerization &amp; Orchestration (Docker, Kubernetes)</w:t>
@@ -1948,9 +2550,13 @@
         </w:pBdr>
         <w:spacing w:after="0" w:line="240" w:lineRule="auto"/>
         <w:ind w:left="259" w:hanging="173"/>
-      </w:pPr>
-      <w:r>
-        <w:rPr>
+        <w:rPr>
+          <w:rFonts w:ascii="Arial" w:hAnsi="Arial" w:cs="Arial"/>
+        </w:rPr>
+      </w:pPr>
+      <w:r>
+        <w:rPr>
+          <w:rFonts w:ascii="Arial" w:hAnsi="Arial" w:cs="Arial"/>
           <w:color w:val="000000"/>
         </w:rPr>
         <w:t>CI/CD (Jenkins, Git)</w:t>
@@ -1971,9 +2577,13 @@
         </w:pBdr>
         <w:spacing w:after="0" w:line="240" w:lineRule="auto"/>
         <w:ind w:left="259" w:hanging="173"/>
-      </w:pPr>
-      <w:r>
-        <w:rPr>
+        <w:rPr>
+          <w:rFonts w:ascii="Arial" w:hAnsi="Arial" w:cs="Arial"/>
+        </w:rPr>
+      </w:pPr>
+      <w:r>
+        <w:rPr>
+          <w:rFonts w:ascii="Arial" w:hAnsi="Arial" w:cs="Arial"/>
           <w:color w:val="000000"/>
         </w:rPr>
         <w:t>High Availability &amp; Disaster Recovery</w:t>
@@ -1994,9 +2604,13 @@
         </w:pBdr>
         <w:spacing w:after="0" w:line="240" w:lineRule="auto"/>
         <w:ind w:left="259" w:hanging="173"/>
-      </w:pPr>
-      <w:r>
-        <w:rPr>
+        <w:rPr>
+          <w:rFonts w:ascii="Arial" w:hAnsi="Arial" w:cs="Arial"/>
+        </w:rPr>
+      </w:pPr>
+      <w:r>
+        <w:rPr>
+          <w:rFonts w:ascii="Arial" w:hAnsi="Arial" w:cs="Arial"/>
           <w:color w:val="000000"/>
         </w:rPr>
         <w:t>.NET Core / ASP.NET Core</w:t>
@@ -2017,9 +2631,13 @@
         </w:pBdr>
         <w:spacing w:after="0" w:line="240" w:lineRule="auto"/>
         <w:ind w:left="259" w:hanging="173"/>
-      </w:pPr>
-      <w:r>
-        <w:rPr>
+        <w:rPr>
+          <w:rFonts w:ascii="Arial" w:hAnsi="Arial" w:cs="Arial"/>
+        </w:rPr>
+      </w:pPr>
+      <w:r>
+        <w:rPr>
+          <w:rFonts w:ascii="Arial" w:hAnsi="Arial" w:cs="Arial"/>
           <w:color w:val="000000"/>
         </w:rPr>
         <w:t>C#</w:t>
@@ -2040,9 +2658,13 @@
         </w:pBdr>
         <w:spacing w:after="0" w:line="240" w:lineRule="auto"/>
         <w:ind w:left="259" w:hanging="173"/>
-      </w:pPr>
-      <w:r>
-        <w:rPr>
+        <w:rPr>
+          <w:rFonts w:ascii="Arial" w:hAnsi="Arial" w:cs="Arial"/>
+        </w:rPr>
+      </w:pPr>
+      <w:r>
+        <w:rPr>
+          <w:rFonts w:ascii="Arial" w:hAnsi="Arial" w:cs="Arial"/>
           <w:color w:val="000000"/>
         </w:rPr>
         <w:t>Entity Framework</w:t>
@@ -2063,9 +2685,13 @@
         </w:pBdr>
         <w:spacing w:after="0" w:line="240" w:lineRule="auto"/>
         <w:ind w:left="259" w:hanging="173"/>
-      </w:pPr>
-      <w:r>
-        <w:rPr>
+        <w:rPr>
+          <w:rFonts w:ascii="Arial" w:hAnsi="Arial" w:cs="Arial"/>
+        </w:rPr>
+      </w:pPr>
+      <w:r>
+        <w:rPr>
+          <w:rFonts w:ascii="Arial" w:hAnsi="Arial" w:cs="Arial"/>
           <w:color w:val="000000"/>
         </w:rPr>
         <w:t>LINQ</w:t>
@@ -2086,9 +2712,13 @@
         </w:pBdr>
         <w:spacing w:after="0" w:line="240" w:lineRule="auto"/>
         <w:ind w:left="259" w:hanging="173"/>
-      </w:pPr>
-      <w:r>
-        <w:rPr>
+        <w:rPr>
+          <w:rFonts w:ascii="Arial" w:hAnsi="Arial" w:cs="Arial"/>
+        </w:rPr>
+      </w:pPr>
+      <w:r>
+        <w:rPr>
+          <w:rFonts w:ascii="Arial" w:hAnsi="Arial" w:cs="Arial"/>
           <w:color w:val="000000"/>
         </w:rPr>
         <w:t>React</w:t>
@@ -2109,9 +2739,13 @@
         </w:pBdr>
         <w:spacing w:after="0" w:line="240" w:lineRule="auto"/>
         <w:ind w:left="259" w:hanging="173"/>
-      </w:pPr>
-      <w:r>
-        <w:rPr>
+        <w:rPr>
+          <w:rFonts w:ascii="Arial" w:hAnsi="Arial" w:cs="Arial"/>
+        </w:rPr>
+      </w:pPr>
+      <w:r>
+        <w:rPr>
+          <w:rFonts w:ascii="Arial" w:hAnsi="Arial" w:cs="Arial"/>
           <w:color w:val="000000"/>
         </w:rPr>
         <w:t>Angular</w:t>
@@ -2132,9 +2766,67 @@
         </w:pBdr>
         <w:spacing w:after="0" w:line="240" w:lineRule="auto"/>
         <w:ind w:left="259" w:hanging="173"/>
-      </w:pPr>
-      <w:r>
-        <w:rPr>
+        <w:rPr>
+          <w:rFonts w:ascii="Arial" w:hAnsi="Arial" w:cs="Arial"/>
+        </w:rPr>
+      </w:pPr>
+      <w:r>
+        <w:rPr>
+          <w:rFonts w:ascii="Arial" w:hAnsi="Arial" w:cs="Arial"/>
+          <w:color w:val="000000"/>
+        </w:rPr>
+        <w:t>OOPS</w:t>
+      </w:r>
+    </w:p>
+    <w:p>
+      <w:pPr>
+        <w:numPr>
+          <w:ilvl w:val="0"/>
+          <w:numId w:val="1"/>
+        </w:numPr>
+        <w:pBdr>
+          <w:top w:val="nil"/>
+          <w:left w:val="nil"/>
+          <w:bottom w:val="nil"/>
+          <w:right w:val="nil"/>
+          <w:between w:val="nil"/>
+        </w:pBdr>
+        <w:spacing w:after="0" w:line="240" w:lineRule="auto"/>
+        <w:ind w:left="259" w:hanging="173"/>
+        <w:rPr>
+          <w:rFonts w:ascii="Arial" w:hAnsi="Arial" w:cs="Arial"/>
+        </w:rPr>
+      </w:pPr>
+      <w:r>
+        <w:rPr>
+          <w:rFonts w:ascii="Arial" w:hAnsi="Arial" w:cs="Arial"/>
+          <w:color w:val="000000"/>
+        </w:rPr>
+        <w:t>Solid Principles</w:t>
+      </w:r>
+    </w:p>
+    <w:p>
+      <w:pPr>
+        <w:numPr>
+          <w:ilvl w:val="0"/>
+          <w:numId w:val="1"/>
+        </w:numPr>
+        <w:pBdr>
+          <w:top w:val="nil"/>
+          <w:left w:val="nil"/>
+          <w:bottom w:val="nil"/>
+          <w:right w:val="nil"/>
+          <w:between w:val="nil"/>
+        </w:pBdr>
+        <w:spacing w:after="0" w:line="240" w:lineRule="auto"/>
+        <w:ind w:left="259" w:hanging="173"/>
+        <w:rPr>
+          <w:rFonts w:ascii="Arial" w:hAnsi="Arial" w:cs="Arial"/>
+        </w:rPr>
+      </w:pPr>
+      <w:r>
+        <w:rPr>
+          <w:rFonts w:ascii="Arial" w:hAnsi="Arial" w:cs="Arial"/>
           <w:color w:val="000000"/>
         </w:rPr>
         <w:t>SQL Server</w:t>
@@ -2155,9 +2847,13 @@
         </w:pBdr>
         <w:spacing w:after="0" w:line="240" w:lineRule="auto"/>
         <w:ind w:left="259" w:hanging="173"/>
-      </w:pPr>
-      <w:r>
-        <w:rPr>
+        <w:rPr>
+          <w:rFonts w:ascii="Arial" w:hAnsi="Arial" w:cs="Arial"/>
+        </w:rPr>
+      </w:pPr>
+      <w:r>
+        <w:rPr>
+          <w:rFonts w:ascii="Arial" w:hAnsi="Arial" w:cs="Arial"/>
           <w:color w:val="000000"/>
         </w:rPr>
         <w:t>PostgreSQL</w:t>
@@ -2178,9 +2874,13 @@
         </w:pBdr>
         <w:spacing w:after="0" w:line="240" w:lineRule="auto"/>
         <w:ind w:left="259" w:hanging="173"/>
-      </w:pPr>
-      <w:r>
-        <w:rPr>
+        <w:rPr>
+          <w:rFonts w:ascii="Arial" w:hAnsi="Arial" w:cs="Arial"/>
+        </w:rPr>
+      </w:pPr>
+      <w:r>
+        <w:rPr>
+          <w:rFonts w:ascii="Arial" w:hAnsi="Arial" w:cs="Arial"/>
           <w:color w:val="000000"/>
         </w:rPr>
         <w:t>REST API Design</w:t>
@@ -2201,32 +2901,40 @@
         </w:pBdr>
         <w:spacing w:after="0" w:line="240" w:lineRule="auto"/>
         <w:ind w:left="259" w:hanging="173"/>
-      </w:pPr>
-      <w:r>
-        <w:rPr>
-          <w:color w:val="000000"/>
-        </w:rPr>
-        <w:t>Technical Standards &amp; Governance</w:t>
-      </w:r>
-    </w:p>
-    <w:p>
-      <w:pPr>
-        <w:numPr>
-          <w:ilvl w:val="0"/>
-          <w:numId w:val="1"/>
-        </w:numPr>
-        <w:pBdr>
-          <w:top w:val="nil"/>
-          <w:left w:val="nil"/>
-          <w:bottom w:val="nil"/>
-          <w:right w:val="nil"/>
-          <w:between w:val="nil"/>
-        </w:pBdr>
-        <w:spacing w:after="0" w:line="240" w:lineRule="auto"/>
-        <w:ind w:left="259" w:hanging="173"/>
-      </w:pPr>
-      <w:r>
-        <w:rPr>
+        <w:rPr>
+          <w:rFonts w:ascii="Arial" w:hAnsi="Arial" w:cs="Arial"/>
+        </w:rPr>
+      </w:pPr>
+      <w:r>
+        <w:rPr>
+          <w:rFonts w:ascii="Arial" w:hAnsi="Arial" w:cs="Arial"/>
+          <w:color w:val="000000"/>
+        </w:rPr>
+        <w:t>Technical Standards &amp; Governance • AI-Assisted Development (Cursor, Claude, GitHub Copilot)</w:t>
+      </w:r>
+    </w:p>
+    <w:p>
+      <w:pPr>
+        <w:numPr>
+          <w:ilvl w:val="0"/>
+          <w:numId w:val="1"/>
+        </w:numPr>
+        <w:pBdr>
+          <w:top w:val="nil"/>
+          <w:left w:val="nil"/>
+          <w:bottom w:val="nil"/>
+          <w:right w:val="nil"/>
+          <w:between w:val="nil"/>
+        </w:pBdr>
+        <w:spacing w:after="0" w:line="240" w:lineRule="auto"/>
+        <w:ind w:left="259" w:hanging="173"/>
+        <w:rPr>
+          <w:rFonts w:ascii="Arial" w:hAnsi="Arial" w:cs="Arial"/>
+        </w:rPr>
+      </w:pPr>
+      <w:r>
+        <w:rPr>
+          <w:rFonts w:ascii="Arial" w:hAnsi="Arial" w:cs="Arial"/>
           <w:color w:val="000000"/>
         </w:rPr>
         <w:t>Code Reviews &amp; Mentoring</w:t>
@@ -2247,9 +2955,13 @@
         </w:pBdr>
         <w:spacing w:after="0" w:line="240" w:lineRule="auto"/>
         <w:ind w:left="259" w:hanging="173"/>
-      </w:pPr>
-      <w:r>
-        <w:rPr>
+        <w:rPr>
+          <w:rFonts w:ascii="Arial" w:hAnsi="Arial" w:cs="Arial"/>
+        </w:rPr>
+      </w:pPr>
+      <w:r>
+        <w:rPr>
+          <w:rFonts w:ascii="Arial" w:hAnsi="Arial" w:cs="Arial"/>
           <w:color w:val="000000"/>
         </w:rPr>
         <w:t>Cross-Team Architecture Alignment</w:t>
@@ -2270,9 +2982,13 @@
         </w:pBdr>
         <w:spacing w:after="0" w:line="240" w:lineRule="auto"/>
         <w:ind w:left="259" w:hanging="173"/>
-      </w:pPr>
-      <w:r>
-        <w:rPr>
+        <w:rPr>
+          <w:rFonts w:ascii="Arial" w:hAnsi="Arial" w:cs="Arial"/>
+        </w:rPr>
+      </w:pPr>
+      <w:r>
+        <w:rPr>
+          <w:rFonts w:ascii="Arial" w:hAnsi="Arial" w:cs="Arial"/>
           <w:color w:val="000000"/>
         </w:rPr>
         <w:t>Stakeholder Management</w:t>
@@ -2293,9 +3009,13 @@
         </w:pBdr>
         <w:spacing w:after="20" w:line="240" w:lineRule="auto"/>
         <w:ind w:left="259" w:hanging="173"/>
-      </w:pPr>
-      <w:r>
-        <w:rPr>
+        <w:rPr>
+          <w:rFonts w:ascii="Arial" w:hAnsi="Arial" w:cs="Arial"/>
+        </w:rPr>
+      </w:pPr>
+      <w:r>
+        <w:rPr>
+          <w:rFonts w:ascii="Arial" w:hAnsi="Arial" w:cs="Arial"/>
           <w:color w:val="000000"/>
         </w:rPr>
         <w:t>Agile/Scrum Delivery</w:t>

</xml_diff>